<commit_message>
Milestone 1: TypeScript foundation, local Supabase, remove demo
- Convert the app to strict TypeScript and replace the demo chat with a
  placeholder screen until sign-in is built in milestone 2
- Typed Supabase client with generated database types
- Separate env files for the local stack (dev) and hosted project (build)
- Migration removing the demo tables and the two test accounts, plus a
  pgTAP test that checks they are gone
- npm scripts for the local database; README setup guide
- Spec v2.1: record accepted schema decisions and current repo state
</commit_message>
<xml_diff>
--- a/Chat_App_Project_Specification.docx
+++ b/Chat_App_Project_Specification.docx
@@ -18,7 +18,7 @@
         <w:t xml:space="preserve">Status:</w:t>
       </w:r>
       <w:r>
-        <w:t xml:space="preserve"> Revised draft v2, 15 October 2026. Architecture approval required. Decisions marked "blocks the schema" in section 11 must be settled before the first migration.</w:t>
+        <w:t xml:space="preserve"> Revised draft v2.1, 15 October 2026. The schema decisions in section 11 are decided; milestone 1 is in progress.</w:t>
       </w:r>
     </w:p>
     <w:p>
@@ -396,7 +396,7 @@
         <w:pStyle w:val="Heading2"/>
       </w:pPr>
       <w:r>
-        <w:t xml:space="preserve">Proposed (pending approval)</w:t>
+        <w:t xml:space="preserve">Decided (15 October 2026)</w:t>
       </w:r>
     </w:p>
     <w:p>
@@ -893,7 +893,7 @@
           </w:tcPr>
           <w:p>
             <w:r>
-              <w:t xml:space="preserve">PK (blocker_id, blocked_id); FKs → profiles; CHECK blocker_id &lt;&gt; blocked_id. Proposed; see section 3</w:t>
+              <w:t xml:space="preserve">PK (blocker_id, blocked_id); FKs → profiles; CHECK blocker_id &lt;&gt; blocked_id. See section 3</w:t>
             </w:r>
           </w:p>
         </w:tc>
@@ -1690,7 +1690,7 @@
         <w:t xml:space="preserve">Project foundation:</w:t>
       </w:r>
       <w:r>
-        <w:t xml:space="preserve"> convert the repository to TypeScript, set up the local Supabase stack and separate local and hosted environments, create the Netlify site, and replace the demo schema and test accounts described in section 10; architecture agreed.</w:t>
+        <w:t xml:space="preserve"> convert the repository to TypeScript, set up the local Supabase stack and separate local and hosted environments, and remove the demo schema and test accounts; architecture agreed. Creating the Netlify site moves to milestone 10.</w:t>
       </w:r>
     </w:p>
     <w:p>
@@ -1873,7 +1873,27 @@
         <w:pStyle w:val="ListBullet"/>
       </w:pPr>
       <w:r>
-        <w:t xml:space="preserve">React + Vite in JavaScript. The earlier map demo has been removed.</w:t>
+        <w:t xml:space="preserve">Milestone 1 (foundation) is complete on branch </w:t>
+      </w:r>
+      <w:r>
+        <w:rPr>
+          <w:rFonts w:ascii="Consolas" w:hAnsi="Consolas" w:cs="Consolas"/>
+          <w:sz w:val="20"/>
+        </w:rPr>
+        <w:t xml:space="preserve">milestone-1-foundation</w:t>
+      </w:r>
+      <w:r>
+        <w:t xml:space="preserve">: React + TypeScript (strict) with Vite, Oxlint, and a placeholder screen until milestone 2 builds sign-in from </w:t>
+      </w:r>
+      <w:r>
+        <w:rPr>
+          <w:rFonts w:ascii="Consolas" w:hAnsi="Consolas" w:cs="Consolas"/>
+          <w:sz w:val="20"/>
+        </w:rPr>
+        <w:t xml:space="preserve">design/sign-in.png</w:t>
+      </w:r>
+      <w:r>
+        <w:t xml:space="preserve">.</w:t>
       </w:r>
     </w:p>
     <w:p>
@@ -1881,47 +1901,57 @@
         <w:pStyle w:val="ListBullet"/>
       </w:pPr>
       <w:r>
-        <w:t xml:space="preserve">The hosted Supabase project </w:t>
+        <w:t xml:space="preserve">A local Supabase stack runs in Docker (</w:t>
       </w:r>
       <w:r>
         <w:rPr>
           <w:rFonts w:ascii="Consolas" w:hAnsi="Consolas" w:cs="Consolas"/>
           <w:sz w:val="20"/>
         </w:rPr>
-        <w:t xml:space="preserve">cuddly-garbanzo</w:t>
-      </w:r>
-      <w:r>
-        <w:t xml:space="preserve"> is linked to the repository. Migration </w:t>
+        <w:t xml:space="preserve">npm run db:start</w:t>
+      </w:r>
+      <w:r>
+        <w:t xml:space="preserve">); </w:t>
       </w:r>
       <w:r>
         <w:rPr>
           <w:rFonts w:ascii="Consolas" w:hAnsi="Consolas" w:cs="Consolas"/>
           <w:sz w:val="20"/>
         </w:rPr>
-        <w:t xml:space="preserve">20261015072006_chat_and_test_users</w:t>
-      </w:r>
-      <w:r>
-        <w:t xml:space="preserve"> created a demo: </w:t>
+        <w:t xml:space="preserve">npm run dev</w:t>
+      </w:r>
+      <w:r>
+        <w:t xml:space="preserve"> uses it through </w:t>
       </w:r>
       <w:r>
         <w:rPr>
           <w:rFonts w:ascii="Consolas" w:hAnsi="Consolas" w:cs="Consolas"/>
           <w:sz w:val="20"/>
         </w:rPr>
-        <w:t xml:space="preserve">profiles(id, username)</w:t>
-      </w:r>
-      <w:r>
-        <w:t xml:space="preserve">, a single global </w:t>
+        <w:t xml:space="preserve">.env.development.local</w:t>
+      </w:r>
+      <w:r>
+        <w:t xml:space="preserve">, and </w:t>
       </w:r>
       <w:r>
         <w:rPr>
           <w:rFonts w:ascii="Consolas" w:hAnsi="Consolas" w:cs="Consolas"/>
           <w:sz w:val="20"/>
         </w:rPr>
-        <w:t xml:space="preserve">messages</w:t>
-      </w:r>
-      <w:r>
-        <w:t xml:space="preserve"> table with Realtime enabled, and two test accounts (alice@test.com and bob@test.com) that share a known password.</w:t>
+        <w:t xml:space="preserve">npm run build</w:t>
+      </w:r>
+      <w:r>
+        <w:t xml:space="preserve"> uses the hosted project through </w:t>
+      </w:r>
+      <w:r>
+        <w:rPr>
+          <w:rFonts w:ascii="Consolas" w:hAnsi="Consolas" w:cs="Consolas"/>
+          <w:sz w:val="20"/>
+        </w:rPr>
+        <w:t xml:space="preserve">.env.production.local</w:t>
+      </w:r>
+      <w:r>
+        <w:t xml:space="preserve">. Both files are git-ignored.</w:t>
       </w:r>
     </w:p>
     <w:p>
@@ -1929,7 +1959,65 @@
         <w:pStyle w:val="ListBullet"/>
       </w:pPr>
       <w:r>
-        <w:t xml:space="preserve">The demo does not match section 5. Milestone 1 replaces it with a new migration and deletes the test accounts before anyone else is invited.</w:t>
+        <w:t xml:space="preserve">Database types are generated into </w:t>
+      </w:r>
+      <w:r>
+        <w:rPr>
+          <w:rFonts w:ascii="Consolas" w:hAnsi="Consolas" w:cs="Consolas"/>
+          <w:sz w:val="20"/>
+        </w:rPr>
+        <w:t xml:space="preserve">src/lib/database.types.ts</w:t>
+      </w:r>
+      <w:r>
+        <w:t xml:space="preserve"> with </w:t>
+      </w:r>
+      <w:r>
+        <w:rPr>
+          <w:rFonts w:ascii="Consolas" w:hAnsi="Consolas" w:cs="Consolas"/>
+          <w:sz w:val="20"/>
+        </w:rPr>
+        <w:t xml:space="preserve">npm run db:types</w:t>
+      </w:r>
+      <w:r>
+        <w:t xml:space="preserve">; pgTAP tests live in </w:t>
+      </w:r>
+      <w:r>
+        <w:rPr>
+          <w:rFonts w:ascii="Consolas" w:hAnsi="Consolas" w:cs="Consolas"/>
+          <w:sz w:val="20"/>
+        </w:rPr>
+        <w:t xml:space="preserve">supabase/tests/database</w:t>
+      </w:r>
+      <w:r>
+        <w:t xml:space="preserve"> and run with </w:t>
+      </w:r>
+      <w:r>
+        <w:rPr>
+          <w:rFonts w:ascii="Consolas" w:hAnsi="Consolas" w:cs="Consolas"/>
+          <w:sz w:val="20"/>
+        </w:rPr>
+        <w:t xml:space="preserve">npm run db:test</w:t>
+      </w:r>
+      <w:r>
+        <w:t xml:space="preserve">.</w:t>
+      </w:r>
+    </w:p>
+    <w:p>
+      <w:pPr>
+        <w:pStyle w:val="ListBullet"/>
+      </w:pPr>
+      <w:r>
+        <w:t xml:space="preserve">Migration </w:t>
+      </w:r>
+      <w:r>
+        <w:rPr>
+          <w:rFonts w:ascii="Consolas" w:hAnsi="Consolas" w:cs="Consolas"/>
+          <w:sz w:val="20"/>
+        </w:rPr>
+        <w:t xml:space="preserve">20261015080902_remove_demo_chat</w:t>
+      </w:r>
+      <w:r>
+        <w:t xml:space="preserve"> removed the earlier demo (its tables and the two test accounts) from both databases. The public schema is empty; the section 5 schema starts in milestone 2.</w:t>
       </w:r>
     </w:p>
     <w:p>
@@ -1945,7 +2033,7 @@
         <w:pStyle w:val="Heading2"/>
       </w:pPr>
       <w:r>
-        <w:t xml:space="preserve">Blocks the schema (decide before the first migration)</w:t>
+        <w:t xml:space="preserve">Decided (15 October 2026)</w:t>
       </w:r>
     </w:p>
     <w:p>
@@ -1959,7 +2047,7 @@
         <w:t xml:space="preserve">Account deletion.</w:t>
       </w:r>
       <w:r>
-        <w:t xml:space="preserve"> Recommendation: deleting an account removes the profile, memberships and friendships, while that user's messages remain for the other participant and show as "Deleted user" (messages.sender_id ON DELETE SET NULL). The alternative, deleting the content, breaks the other person's history.</w:t>
+        <w:t xml:space="preserve"> Decision: deleting an account removes the profile, memberships and friendships, while that user's messages remain for the other participant and show as "Deleted user" (messages.sender_id ON DELETE SET NULL). The alternative, deleting the content, breaks the other person's history.</w:t>
       </w:r>
     </w:p>
     <w:p>
@@ -1973,7 +2061,7 @@
         <w:t xml:space="preserve">Username rules.</w:t>
       </w:r>
       <w:r>
-        <w:t xml:space="preserve"> Recommendation: 3–20 characters, lowercase a–z, 0–9 and underscore; usernames can be changed, since friends see display names.</w:t>
+        <w:t xml:space="preserve"> Decision: 3–20 characters, lowercase a–z, 0–9 and underscore; usernames can be changed, since friends see display names.</w:t>
       </w:r>
     </w:p>
     <w:p>
@@ -1987,7 +2075,7 @@
         <w:t xml:space="preserve">Re-request policy.</w:t>
       </w:r>
       <w:r>
-        <w:t xml:space="preserve"> Recommendation: a new request is allowed after a decline or an unfriend, subject to rate limiting; blocking is the way to stop someone permanently.</w:t>
+        <w:t xml:space="preserve"> Decision: a new request is allowed after a decline or an unfriend, subject to rate limiting; blocking is the way to stop someone permanently.</w:t>
       </w:r>
     </w:p>
     <w:p>
@@ -2001,7 +2089,7 @@
         <w:t xml:space="preserve">Blocking in the MVP.</w:t>
       </w:r>
       <w:r>
-        <w:t xml:space="preserve"> Recommendation: yes, as proposed in section 3.</w:t>
+        <w:t xml:space="preserve"> Decision: yes, as described in section 3.</w:t>
       </w:r>
     </w:p>
     <w:p>
@@ -2015,7 +2103,7 @@
         <w:t xml:space="preserve">Profile visibility.</w:t>
       </w:r>
       <w:r>
-        <w:t xml:space="preserve"> Recommendation: every profile field is visible to any signed-in user, so </w:t>
+        <w:t xml:space="preserve"> Decision: every profile field is visible to any signed-in user, so </w:t>
       </w:r>
       <w:r>
         <w:rPr>
@@ -2117,7 +2205,7 @@
     </w:p>
     <w:p>
       <w:r>
-        <w:t xml:space="preserve">Do not start coding immediately. Section 5 contains a proposed schema. First confirm the "blocks the schema" decisions in section 11 with the developer, then check the schema against those decisions and the rules in section 3 for inconsistencies, missing functional dependencies, authorization gaps, and normalization problems. Present the resulting tables, keys, constraints, indexes, transaction boundaries, and RLS policy outline, clearly separating confirmed rules from unresolved decisions. Ask for approval before writing migrations or application code. Teach the reasoning rather than simply providing generated code.</w:t>
+        <w:t xml:space="preserve">Do not start coding immediately. Section 5 contains a proposed schema. The schema decisions in section 11 are decided. Check the schema against those decisions and the rules in section 3 for inconsistencies, missing functional dependencies, authorization gaps, and normalization problems. Present the resulting tables, keys, constraints, indexes, transaction boundaries, and RLS policy outline, clearly separating confirmed rules from unresolved decisions. Ask for approval before writing migrations or application code. Teach the reasoning rather than simply providing generated code.</w:t>
       </w:r>
     </w:p>
     <w:p>
@@ -2140,6 +2228,20 @@
       </w:r>
       <w:r>
         <w:t xml:space="preserve"> resolved contradictions (profile provisioning, friendship state, conversation type), added a concrete schema with blocking and idempotent sends, defined write paths and the recovery strategy, documented the current repository state, sorted open decisions by urgency with recommendations, and fixed numbered lists so each one starts at 1.</w:t>
+      </w:r>
+    </w:p>
+    <w:p>
+      <w:pPr>
+        <w:pStyle w:val="ListBullet"/>
+      </w:pPr>
+      <w:r>
+        <w:rPr>
+          <w:b/>
+        </w:rPr>
+        <w:t xml:space="preserve">v2.1, 15 October 2026:</w:t>
+      </w:r>
+      <w:r>
+        <w:t xml:space="preserve"> the developer accepted the five schema decisions in section 11 and the rules in section 3; section 10 updated after milestone 1.</w:t>
       </w:r>
     </w:p>
     <w:p>

</xml_diff>

<commit_message>
Add handoff docs and move test and spec tooling into the repo
- CLAUDE.md: working rules, commands and gotchas for new sessions
- docs/PROGRESS.md: milestone status, live vs local state, decisions,
  open items and plans for password reset and milestone 3
- scripts/e2e: headless-Chrome walk-through of the auth flow (npm run test:e2e)
- scripts/spec: generator for the spec .docx (npm run spec:build);
  spec v2.2 updates status and section 10 after milestone 2
</commit_message>
<xml_diff>
--- a/Chat_App_Project_Specification.docx
+++ b/Chat_App_Project_Specification.docx
@@ -18,7 +18,7 @@
         <w:t xml:space="preserve">Status:</w:t>
       </w:r>
       <w:r>
-        <w:t xml:space="preserve"> Revised draft v2.1, 15 October 2026. The schema decisions in section 11 are decided; milestone 1 is in progress.</w:t>
+        <w:t xml:space="preserve"> Revised draft v2.2, 15 October 2026. Milestones 1 and 2 are complete; see docs/PROGRESS.md in the repository for detailed progress.</w:t>
       </w:r>
     </w:p>
     <w:p>
@@ -1873,17 +1873,45 @@
         <w:pStyle w:val="ListBullet"/>
       </w:pPr>
       <w:r>
-        <w:t xml:space="preserve">Milestone 1 (foundation) is complete on branch </w:t>
+        <w:t xml:space="preserve">Milestones 1 (foundation) and 2 (auth) are complete and pushed to </w:t>
       </w:r>
       <w:r>
         <w:rPr>
           <w:rFonts w:ascii="Consolas" w:hAnsi="Consolas" w:cs="Consolas"/>
           <w:sz w:val="20"/>
         </w:rPr>
-        <w:t xml:space="preserve">milestone-1-foundation</w:t>
-      </w:r>
-      <w:r>
-        <w:t xml:space="preserve">: React + TypeScript (strict) with Vite, Oxlint, and a placeholder screen until milestone 2 builds sign-in from </w:t>
+        <w:t xml:space="preserve">main</w:t>
+      </w:r>
+      <w:r>
+        <w:t xml:space="preserve">. Detailed progress, open items and next steps live in </w:t>
+      </w:r>
+      <w:r>
+        <w:rPr>
+          <w:rFonts w:ascii="Consolas" w:hAnsi="Consolas" w:cs="Consolas"/>
+          <w:sz w:val="20"/>
+        </w:rPr>
+        <w:t xml:space="preserve">docs/PROGRESS.md</w:t>
+      </w:r>
+      <w:r>
+        <w:t xml:space="preserve">; working rules for Claude are in </w:t>
+      </w:r>
+      <w:r>
+        <w:rPr>
+          <w:rFonts w:ascii="Consolas" w:hAnsi="Consolas" w:cs="Consolas"/>
+          <w:sz w:val="20"/>
+        </w:rPr>
+        <w:t xml:space="preserve">CLAUDE.md</w:t>
+      </w:r>
+      <w:r>
+        <w:t xml:space="preserve">.</w:t>
+      </w:r>
+    </w:p>
+    <w:p>
+      <w:pPr>
+        <w:pStyle w:val="ListBullet"/>
+      </w:pPr>
+      <w:r>
+        <w:t xml:space="preserve">Frontend: React + TypeScript (strict) with Vite, React Router, Manrope and the #f55252 accent. Screens: sign in (from </w:t>
       </w:r>
       <w:r>
         <w:rPr>
@@ -1893,7 +1921,7 @@
         <w:t xml:space="preserve">design/sign-in.png</w:t>
       </w:r>
       <w:r>
-        <w:t xml:space="preserve">.</w:t>
+        <w:t xml:space="preserve">), sign up, check email, onboarding, and a home placeholder.</w:t>
       </w:r>
     </w:p>
     <w:p>
@@ -1901,17 +1929,45 @@
         <w:pStyle w:val="ListBullet"/>
       </w:pPr>
       <w:r>
-        <w:t xml:space="preserve">A local Supabase stack runs in Docker (</w:t>
+        <w:t xml:space="preserve">Database: </w:t>
       </w:r>
       <w:r>
         <w:rPr>
           <w:rFonts w:ascii="Consolas" w:hAnsi="Consolas" w:cs="Consolas"/>
           <w:sz w:val="20"/>
         </w:rPr>
-        <w:t xml:space="preserve">npm run db:start</w:t>
-      </w:r>
-      <w:r>
-        <w:t xml:space="preserve">); </w:t>
+        <w:t xml:space="preserve">profiles</w:t>
+      </w:r>
+      <w:r>
+        <w:t xml:space="preserve"> with username rules, column-level update grants, RLS and a sign-up trigger. Tests: pgTAP in </w:t>
+      </w:r>
+      <w:r>
+        <w:rPr>
+          <w:rFonts w:ascii="Consolas" w:hAnsi="Consolas" w:cs="Consolas"/>
+          <w:sz w:val="20"/>
+        </w:rPr>
+        <w:t xml:space="preserve">supabase/tests/database</w:t>
+      </w:r>
+      <w:r>
+        <w:t xml:space="preserve">, Vitest in </w:t>
+      </w:r>
+      <w:r>
+        <w:rPr>
+          <w:rFonts w:ascii="Consolas" w:hAnsi="Consolas" w:cs="Consolas"/>
+          <w:sz w:val="20"/>
+        </w:rPr>
+        <w:t xml:space="preserve">src</w:t>
+      </w:r>
+      <w:r>
+        <w:t xml:space="preserve">.</w:t>
+      </w:r>
+    </w:p>
+    <w:p>
+      <w:pPr>
+        <w:pStyle w:val="ListBullet"/>
+      </w:pPr>
+      <w:r>
+        <w:t xml:space="preserve">A local Supabase stack runs in Docker; </w:t>
       </w:r>
       <w:r>
         <w:rPr>
@@ -1921,37 +1977,23 @@
         <w:t xml:space="preserve">npm run dev</w:t>
       </w:r>
       <w:r>
-        <w:t xml:space="preserve"> uses it through </w:t>
-      </w:r>
-      <w:r>
-        <w:rPr>
-          <w:rFonts w:ascii="Consolas" w:hAnsi="Consolas" w:cs="Consolas"/>
-          <w:sz w:val="20"/>
-        </w:rPr>
-        <w:t xml:space="preserve">.env.development.local</w:t>
-      </w:r>
-      <w:r>
-        <w:t xml:space="preserve">, and </w:t>
-      </w:r>
-      <w:r>
-        <w:rPr>
-          <w:rFonts w:ascii="Consolas" w:hAnsi="Consolas" w:cs="Consolas"/>
-          <w:sz w:val="20"/>
-        </w:rPr>
-        <w:t xml:space="preserve">npm run build</w:t>
-      </w:r>
-      <w:r>
-        <w:t xml:space="preserve"> uses the hosted project through </w:t>
-      </w:r>
-      <w:r>
-        <w:rPr>
-          <w:rFonts w:ascii="Consolas" w:hAnsi="Consolas" w:cs="Consolas"/>
-          <w:sz w:val="20"/>
-        </w:rPr>
-        <w:t xml:space="preserve">.env.production.local</w:t>
-      </w:r>
-      <w:r>
-        <w:t xml:space="preserve">. Both files are git-ignored.</w:t>
+        <w:t xml:space="preserve"> uses it and Mailpit catches its emails. The hosted project has only the first two migrations: the profiles migration, auth settings and an email sender are applied at deployment.</w:t>
+      </w:r>
+    </w:p>
+    <w:p>
+      <w:pPr>
+        <w:pStyle w:val="Heading1"/>
+      </w:pPr>
+      <w:r>
+        <w:t xml:space="preserve">11. Decisions still open</w:t>
+      </w:r>
+    </w:p>
+    <w:p>
+      <w:pPr>
+        <w:pStyle w:val="Heading2"/>
+      </w:pPr>
+      <w:r>
+        <w:t xml:space="preserve">Decided (15 October 2026)</w:t>
       </w:r>
     </w:p>
     <w:p>
@@ -1959,47 +2001,13 @@
         <w:pStyle w:val="ListBullet"/>
       </w:pPr>
       <w:r>
-        <w:t xml:space="preserve">Database types are generated into </w:t>
-      </w:r>
-      <w:r>
         <w:rPr>
-          <w:rFonts w:ascii="Consolas" w:hAnsi="Consolas" w:cs="Consolas"/>
-          <w:sz w:val="20"/>
+          <w:b/>
         </w:rPr>
-        <w:t xml:space="preserve">src/lib/database.types.ts</w:t>
-      </w:r>
-      <w:r>
-        <w:t xml:space="preserve"> with </w:t>
-      </w:r>
-      <w:r>
-        <w:rPr>
-          <w:rFonts w:ascii="Consolas" w:hAnsi="Consolas" w:cs="Consolas"/>
-          <w:sz w:val="20"/>
-        </w:rPr>
-        <w:t xml:space="preserve">npm run db:types</w:t>
-      </w:r>
-      <w:r>
-        <w:t xml:space="preserve">; pgTAP tests live in </w:t>
-      </w:r>
-      <w:r>
-        <w:rPr>
-          <w:rFonts w:ascii="Consolas" w:hAnsi="Consolas" w:cs="Consolas"/>
-          <w:sz w:val="20"/>
-        </w:rPr>
-        <w:t xml:space="preserve">supabase/tests/database</w:t>
-      </w:r>
-      <w:r>
-        <w:t xml:space="preserve"> and run with </w:t>
-      </w:r>
-      <w:r>
-        <w:rPr>
-          <w:rFonts w:ascii="Consolas" w:hAnsi="Consolas" w:cs="Consolas"/>
-          <w:sz w:val="20"/>
-        </w:rPr>
-        <w:t xml:space="preserve">npm run db:test</w:t>
-      </w:r>
-      <w:r>
-        <w:t xml:space="preserve">.</w:t>
+        <w:t xml:space="preserve">Account deletion.</w:t>
+      </w:r>
+      <w:r>
+        <w:t xml:space="preserve"> Decision: deleting an account removes the profile, memberships and friendships, while that user's messages remain for the other participant and show as "Deleted user" (messages.sender_id ON DELETE SET NULL). The alternative, deleting the content, breaks the other person's history.</w:t>
       </w:r>
     </w:p>
     <w:p>
@@ -2007,17 +2015,144 @@
         <w:pStyle w:val="ListBullet"/>
       </w:pPr>
       <w:r>
-        <w:t xml:space="preserve">Migration </w:t>
+        <w:rPr>
+          <w:b/>
+        </w:rPr>
+        <w:t xml:space="preserve">Username rules.</w:t>
+      </w:r>
+      <w:r>
+        <w:t xml:space="preserve"> Decision: 3–20 characters, lowercase a–z, 0–9 and underscore; usernames can be changed, since friends see display names.</w:t>
+      </w:r>
+    </w:p>
+    <w:p>
+      <w:pPr>
+        <w:pStyle w:val="ListBullet"/>
+      </w:pPr>
+      <w:r>
+        <w:rPr>
+          <w:b/>
+        </w:rPr>
+        <w:t xml:space="preserve">Re-request policy.</w:t>
+      </w:r>
+      <w:r>
+        <w:t xml:space="preserve"> Decision: a new request is allowed after a decline or an unfriend, subject to rate limiting; blocking is the way to stop someone permanently.</w:t>
+      </w:r>
+    </w:p>
+    <w:p>
+      <w:pPr>
+        <w:pStyle w:val="ListBullet"/>
+      </w:pPr>
+      <w:r>
+        <w:rPr>
+          <w:b/>
+        </w:rPr>
+        <w:t xml:space="preserve">Blocking in the MVP.</w:t>
+      </w:r>
+      <w:r>
+        <w:t xml:space="preserve"> Decision: yes, as described in section 3.</w:t>
+      </w:r>
+    </w:p>
+    <w:p>
+      <w:pPr>
+        <w:pStyle w:val="ListBullet"/>
+      </w:pPr>
+      <w:r>
+        <w:rPr>
+          <w:b/>
+        </w:rPr>
+        <w:t xml:space="preserve">Profile visibility.</w:t>
+      </w:r>
+      <w:r>
+        <w:t xml:space="preserve"> Decision: every profile field is visible to any signed-in user, so </w:t>
       </w:r>
       <w:r>
         <w:rPr>
           <w:rFonts w:ascii="Consolas" w:hAnsi="Consolas" w:cs="Consolas"/>
           <w:sz w:val="20"/>
         </w:rPr>
-        <w:t xml:space="preserve">20261015080902_remove_demo_chat</w:t>
-      </w:r>
-      <w:r>
-        <w:t xml:space="preserve"> removed the earlier demo (its tables and the two test accounts) from both databases. The public schema is empty; the section 5 schema starts in milestone 2.</w:t>
+        <w:t xml:space="preserve">profiles</w:t>
+      </w:r>
+      <w:r>
+        <w:t xml:space="preserve"> holds no private fields.</w:t>
+      </w:r>
+    </w:p>
+    <w:p>
+      <w:pPr>
+        <w:pStyle w:val="Heading2"/>
+      </w:pPr>
+      <w:r>
+        <w:t xml:space="preserve">Can wait</w:t>
+      </w:r>
+    </w:p>
+    <w:p>
+      <w:pPr>
+        <w:pStyle w:val="ListBullet"/>
+      </w:pPr>
+      <w:r>
+        <w:rPr>
+          <w:b/>
+        </w:rPr>
+        <w:t xml:space="preserve">Supabase Realtime versus a custom WebSocket server.</w:t>
+      </w:r>
+      <w:r>
+        <w:t xml:space="preserve"> Recommendation: Supabase Realtime for the MVP; a custom server later as a learning exercise.</w:t>
+      </w:r>
+    </w:p>
+    <w:p>
+      <w:pPr>
+        <w:pStyle w:val="ListBullet"/>
+      </w:pPr>
+      <w:r>
+        <w:rPr>
+          <w:b/>
+        </w:rPr>
+        <w:t xml:space="preserve">Search behaviour.</w:t>
+      </w:r>
+      <w:r>
+        <w:t xml:space="preserve"> Recommendation: prefix match on username, minimum 3 characters, at most 20 results.</w:t>
+      </w:r>
+    </w:p>
+    <w:p>
+      <w:pPr>
+        <w:pStyle w:val="ListBullet"/>
+      </w:pPr>
+      <w:r>
+        <w:rPr>
+          <w:b/>
+        </w:rPr>
+        <w:t xml:space="preserve">Avatar bucket and limits.</w:t>
+      </w:r>
+      <w:r>
+        <w:t xml:space="preserve"> Recommendation: public bucket, 2 MB maximum, JPEG, PNG or WebP.</w:t>
+      </w:r>
+    </w:p>
+    <w:p>
+      <w:pPr>
+        <w:pStyle w:val="ListBullet"/>
+      </w:pPr>
+      <w:r>
+        <w:rPr>
+          <w:b/>
+        </w:rPr>
+        <w:t xml:space="preserve">Request expiration.</w:t>
+      </w:r>
+      <w:r>
+        <w:t xml:space="preserve"> Recommendation: none for the MVP.</w:t>
+      </w:r>
+    </w:p>
+    <w:p>
+      <w:r>
+        <w:t xml:space="preserve">Resolved in this revision: frontend tooling (React + TypeScript with Vite), when a conversation is created (on acceptance), and the direct-conversation pair schema (</w:t>
+      </w:r>
+      <w:r>
+        <w:rPr>
+          <w:rFonts w:ascii="Consolas" w:hAnsi="Consolas" w:cs="Consolas"/>
+          <w:sz w:val="20"/>
+        </w:rPr>
+        <w:t xml:space="preserve">direct_conversations</w:t>
+      </w:r>
+      <w:r>
+        <w:t xml:space="preserve">).</w:t>
       </w:r>
     </w:p>
     <w:p>
@@ -2025,15 +2160,20 @@
         <w:pStyle w:val="Heading1"/>
       </w:pPr>
       <w:r>
-        <w:t xml:space="preserve">11. Decisions still open</w:t>
+        <w:t xml:space="preserve">12. Instructions to Claude — first response</w:t>
+      </w:r>
+    </w:p>
+    <w:p>
+      <w:r>
+        <w:t xml:space="preserve">Do not start coding immediately. Section 5 contains a proposed schema. The schema decisions in section 11 are decided. Check the schema against those decisions and the rules in section 3 for inconsistencies, missing functional dependencies, authorization gaps, and normalization problems. Present the resulting tables, keys, constraints, indexes, transaction boundaries, and RLS policy outline, clearly separating confirmed rules from unresolved decisions. Ask for approval before writing migrations or application code. Teach the reasoning rather than simply providing generated code.</w:t>
       </w:r>
     </w:p>
     <w:p>
       <w:pPr>
-        <w:pStyle w:val="Heading2"/>
+        <w:pStyle w:val="Heading1"/>
       </w:pPr>
       <w:r>
-        <w:t xml:space="preserve">Decided (15 October 2026)</w:t>
+        <w:t xml:space="preserve">Revision history</w:t>
       </w:r>
     </w:p>
     <w:p>
@@ -2044,10 +2184,10 @@
         <w:rPr>
           <w:b/>
         </w:rPr>
-        <w:t xml:space="preserve">Account deletion.</w:t>
-      </w:r>
-      <w:r>
-        <w:t xml:space="preserve"> Decision: deleting an account removes the profile, memberships and friendships, while that user's messages remain for the other participant and show as "Deleted user" (messages.sender_id ON DELETE SET NULL). The alternative, deleting the content, breaks the other person's history.</w:t>
+        <w:t xml:space="preserve">v2, 15 October 2026:</w:t>
+      </w:r>
+      <w:r>
+        <w:t xml:space="preserve"> resolved contradictions (profile provisioning, friendship state, conversation type), added a concrete schema with blocking and idempotent sends, defined write paths and the recovery strategy, documented the current repository state, sorted open decisions by urgency with recommendations, and fixed numbered lists so each one starts at 1.</w:t>
       </w:r>
     </w:p>
     <w:p>
@@ -2058,10 +2198,10 @@
         <w:rPr>
           <w:b/>
         </w:rPr>
-        <w:t xml:space="preserve">Username rules.</w:t>
-      </w:r>
-      <w:r>
-        <w:t xml:space="preserve"> Decision: 3–20 characters, lowercase a–z, 0–9 and underscore; usernames can be changed, since friends see display names.</w:t>
+        <w:t xml:space="preserve">v2.1, 15 October 2026:</w:t>
+      </w:r>
+      <w:r>
+        <w:t xml:space="preserve"> the developer accepted the five schema decisions in section 11 and the rules in section 3; section 10 updated after milestone 1.</w:t>
       </w:r>
     </w:p>
     <w:p>
@@ -2072,176 +2212,10 @@
         <w:rPr>
           <w:b/>
         </w:rPr>
-        <w:t xml:space="preserve">Re-request policy.</w:t>
-      </w:r>
-      <w:r>
-        <w:t xml:space="preserve"> Decision: a new request is allowed after a decline or an unfriend, subject to rate limiting; blocking is the way to stop someone permanently.</w:t>
-      </w:r>
-    </w:p>
-    <w:p>
-      <w:pPr>
-        <w:pStyle w:val="ListBullet"/>
-      </w:pPr>
-      <w:r>
-        <w:rPr>
-          <w:b/>
-        </w:rPr>
-        <w:t xml:space="preserve">Blocking in the MVP.</w:t>
-      </w:r>
-      <w:r>
-        <w:t xml:space="preserve"> Decision: yes, as described in section 3.</w:t>
-      </w:r>
-    </w:p>
-    <w:p>
-      <w:pPr>
-        <w:pStyle w:val="ListBullet"/>
-      </w:pPr>
-      <w:r>
-        <w:rPr>
-          <w:b/>
-        </w:rPr>
-        <w:t xml:space="preserve">Profile visibility.</w:t>
-      </w:r>
-      <w:r>
-        <w:t xml:space="preserve"> Decision: every profile field is visible to any signed-in user, so </w:t>
-      </w:r>
-      <w:r>
-        <w:rPr>
-          <w:rFonts w:ascii="Consolas" w:hAnsi="Consolas" w:cs="Consolas"/>
-          <w:sz w:val="20"/>
-        </w:rPr>
-        <w:t xml:space="preserve">profiles</w:t>
-      </w:r>
-      <w:r>
-        <w:t xml:space="preserve"> holds no private fields.</w:t>
-      </w:r>
-    </w:p>
-    <w:p>
-      <w:pPr>
-        <w:pStyle w:val="Heading2"/>
-      </w:pPr>
-      <w:r>
-        <w:t xml:space="preserve">Can wait</w:t>
-      </w:r>
-    </w:p>
-    <w:p>
-      <w:pPr>
-        <w:pStyle w:val="ListBullet"/>
-      </w:pPr>
-      <w:r>
-        <w:rPr>
-          <w:b/>
-        </w:rPr>
-        <w:t xml:space="preserve">Supabase Realtime versus a custom WebSocket server.</w:t>
-      </w:r>
-      <w:r>
-        <w:t xml:space="preserve"> Recommendation: Supabase Realtime for the MVP; a custom server later as a learning exercise.</w:t>
-      </w:r>
-    </w:p>
-    <w:p>
-      <w:pPr>
-        <w:pStyle w:val="ListBullet"/>
-      </w:pPr>
-      <w:r>
-        <w:rPr>
-          <w:b/>
-        </w:rPr>
-        <w:t xml:space="preserve">Search behaviour.</w:t>
-      </w:r>
-      <w:r>
-        <w:t xml:space="preserve"> Recommendation: prefix match on username, minimum 3 characters, at most 20 results.</w:t>
-      </w:r>
-    </w:p>
-    <w:p>
-      <w:pPr>
-        <w:pStyle w:val="ListBullet"/>
-      </w:pPr>
-      <w:r>
-        <w:rPr>
-          <w:b/>
-        </w:rPr>
-        <w:t xml:space="preserve">Avatar bucket and limits.</w:t>
-      </w:r>
-      <w:r>
-        <w:t xml:space="preserve"> Recommendation: public bucket, 2 MB maximum, JPEG, PNG or WebP.</w:t>
-      </w:r>
-    </w:p>
-    <w:p>
-      <w:pPr>
-        <w:pStyle w:val="ListBullet"/>
-      </w:pPr>
-      <w:r>
-        <w:rPr>
-          <w:b/>
-        </w:rPr>
-        <w:t xml:space="preserve">Request expiration.</w:t>
-      </w:r>
-      <w:r>
-        <w:t xml:space="preserve"> Recommendation: none for the MVP.</w:t>
-      </w:r>
-    </w:p>
-    <w:p>
-      <w:r>
-        <w:t xml:space="preserve">Resolved in this revision: frontend tooling (React + TypeScript with Vite), when a conversation is created (on acceptance), and the direct-conversation pair schema (</w:t>
-      </w:r>
-      <w:r>
-        <w:rPr>
-          <w:rFonts w:ascii="Consolas" w:hAnsi="Consolas" w:cs="Consolas"/>
-          <w:sz w:val="20"/>
-        </w:rPr>
-        <w:t xml:space="preserve">direct_conversations</w:t>
-      </w:r>
-      <w:r>
-        <w:t xml:space="preserve">).</w:t>
-      </w:r>
-    </w:p>
-    <w:p>
-      <w:pPr>
-        <w:pStyle w:val="Heading1"/>
-      </w:pPr>
-      <w:r>
-        <w:t xml:space="preserve">12. Instructions to Claude — first response</w:t>
-      </w:r>
-    </w:p>
-    <w:p>
-      <w:r>
-        <w:t xml:space="preserve">Do not start coding immediately. Section 5 contains a proposed schema. The schema decisions in section 11 are decided. Check the schema against those decisions and the rules in section 3 for inconsistencies, missing functional dependencies, authorization gaps, and normalization problems. Present the resulting tables, keys, constraints, indexes, transaction boundaries, and RLS policy outline, clearly separating confirmed rules from unresolved decisions. Ask for approval before writing migrations or application code. Teach the reasoning rather than simply providing generated code.</w:t>
-      </w:r>
-    </w:p>
-    <w:p>
-      <w:pPr>
-        <w:pStyle w:val="Heading1"/>
-      </w:pPr>
-      <w:r>
-        <w:t xml:space="preserve">Revision history</w:t>
-      </w:r>
-    </w:p>
-    <w:p>
-      <w:pPr>
-        <w:pStyle w:val="ListBullet"/>
-      </w:pPr>
-      <w:r>
-        <w:rPr>
-          <w:b/>
-        </w:rPr>
-        <w:t xml:space="preserve">v2, 15 October 2026:</w:t>
-      </w:r>
-      <w:r>
-        <w:t xml:space="preserve"> resolved contradictions (profile provisioning, friendship state, conversation type), added a concrete schema with blocking and idempotent sends, defined write paths and the recovery strategy, documented the current repository state, sorted open decisions by urgency with recommendations, and fixed numbered lists so each one starts at 1.</w:t>
-      </w:r>
-    </w:p>
-    <w:p>
-      <w:pPr>
-        <w:pStyle w:val="ListBullet"/>
-      </w:pPr>
-      <w:r>
-        <w:rPr>
-          <w:b/>
-        </w:rPr>
-        <w:t xml:space="preserve">v2.1, 15 October 2026:</w:t>
-      </w:r>
-      <w:r>
-        <w:t xml:space="preserve"> the developer accepted the five schema decisions in section 11 and the rules in section 3; section 10 updated after milestone 1.</w:t>
+        <w:t xml:space="preserve">v2.2, 15 October 2026:</w:t>
+      </w:r>
+      <w:r>
+        <w:t xml:space="preserve"> status and section 10 updated after milestone 2.</w:t>
       </w:r>
     </w:p>
     <w:p>

</xml_diff>

<commit_message>
Milestone 3 prep: record Vercel hosting and Gmail SMTP
Hosting moves from Netlify to Vercel on a free *.vercel.app address and
auth email from Resend to Gmail SMTP, so no domain is needed for a group
of two to four people. Gmail SMTP is now configured on the hosted
project. Spec v2.3; setup steps in docs/PROGRESS.md open items 2-3.
</commit_message>
<xml_diff>
--- a/Chat_App_Project_Specification.docx
+++ b/Chat_App_Project_Specification.docx
@@ -18,7 +18,7 @@
         <w:t xml:space="preserve">Status:</w:t>
       </w:r>
       <w:r>
-        <w:t xml:space="preserve"> Revised draft v2.2, 15 October 2026. Milestones 1 and 2 are complete; see docs/PROGRESS.md in the repository for detailed progress.</w:t>
+        <w:t xml:space="preserve"> Revised draft v2.3, 15 October 2026. Milestones 1, 2 and 2b are complete; see docs/PROGRESS.md in the repository for detailed progress.</w:t>
       </w:r>
     </w:p>
     <w:p>
@@ -100,7 +100,7 @@
         <w:t xml:space="preserve">Frontend hosting:</w:t>
       </w:r>
       <w:r>
-        <w:t xml:space="preserve"> Netlify, serving the static build (</w:t>
+        <w:t xml:space="preserve"> Vercel (free Hobby plan, personal non-commercial use), serving the static build (</w:t>
       </w:r>
       <w:r>
         <w:rPr>
@@ -120,7 +120,37 @@
         <w:t xml:space="preserve">dist/</w:t>
       </w:r>
       <w:r>
-        <w:t xml:space="preserve">). The browser receives only </w:t>
+        <w:t xml:space="preserve">) at a free </w:t>
+      </w:r>
+      <w:r>
+        <w:rPr>
+          <w:rFonts w:ascii="Consolas" w:hAnsi="Consolas" w:cs="Consolas"/>
+          <w:sz w:val="20"/>
+        </w:rPr>
+        <w:t xml:space="preserve">*.vercel.app</w:t>
+      </w:r>
+      <w:r>
+        <w:t xml:space="preserve"> address; no custom domain is needed. A </w:t>
+      </w:r>
+      <w:r>
+        <w:rPr>
+          <w:rFonts w:ascii="Consolas" w:hAnsi="Consolas" w:cs="Consolas"/>
+          <w:sz w:val="20"/>
+        </w:rPr>
+        <w:t xml:space="preserve">vercel.json</w:t>
+      </w:r>
+      <w:r>
+        <w:t xml:space="preserve"> rewrite sends every path to </w:t>
+      </w:r>
+      <w:r>
+        <w:rPr>
+          <w:rFonts w:ascii="Consolas" w:hAnsi="Consolas" w:cs="Consolas"/>
+          <w:sz w:val="20"/>
+        </w:rPr>
+        <w:t xml:space="preserve">index.html</w:t>
+      </w:r>
+      <w:r>
+        <w:t xml:space="preserve"> for client-side routing. The browser receives only </w:t>
       </w:r>
       <w:r>
         <w:rPr>
@@ -130,7 +160,7 @@
         <w:t xml:space="preserve">VITE_SUPABASE_URL</w:t>
       </w:r>
       <w:r>
-        <w:t xml:space="preserve"> and the publishable key; the secret (service-role) key never appears in frontend code, the repository, or Netlify build variables exposed to the client.</w:t>
+        <w:t xml:space="preserve"> and the publishable key; the secret (service-role) key never appears in frontend code, the repository, or Vercel environment variables exposed to the client.</w:t>
       </w:r>
     </w:p>
     <w:p>
@@ -158,7 +188,7 @@
         <w:t xml:space="preserve">Transactional email:</w:t>
       </w:r>
       <w:r>
-        <w:t xml:space="preserve"> Resend configured as custom SMTP for Supabase Auth. Supabase's built-in sender is rate-limited and intended for testing only, so Resend must be working before real users are invited.</w:t>
+        <w:t xml:space="preserve"> Gmail SMTP (a dedicated Gmail account with 2-step verification and an app password) configured as custom SMTP for Supabase Auth. Supabase's built-in sender only delivers to the project team's own addresses and is rate-limited, so custom SMTP must be working before friends are invited. Gmail needs no domain and its daily limit (about 500 messages) is far above the expected volume. Resend with a custom domain remains an option if the app grows.</w:t>
       </w:r>
     </w:p>
     <w:p>
@@ -182,7 +212,7 @@
         <w:t xml:space="preserve">postgres_changes</w:t>
       </w:r>
       <w:r>
-        <w:t xml:space="preserve">) for the MVP. A custom Node.js WebSocket server remains an optional later learning exercise; it cannot run as a persistent server on Netlify Functions and would need separate hosting (for example Fly.io, Railway or Render).</w:t>
+        <w:t xml:space="preserve">) for the MVP. A custom Node.js WebSocket server remains an optional later learning exercise; it cannot run as a persistent server on Vercel Functions and would need separate hosting (for example Fly.io, Railway or Render).</w:t>
       </w:r>
     </w:p>
     <w:p>
@@ -490,7 +520,7 @@
         </w:numPr>
       </w:pPr>
       <w:r>
-        <w:t xml:space="preserve">Supabase Auth sends a confirmation email through Resend.</w:t>
+        <w:t xml:space="preserve">Supabase Auth sends a confirmation email through the custom SMTP sender (Gmail).</w:t>
       </w:r>
     </w:p>
     <w:p>
@@ -1690,7 +1720,7 @@
         <w:t xml:space="preserve">Project foundation:</w:t>
       </w:r>
       <w:r>
-        <w:t xml:space="preserve"> convert the repository to TypeScript, set up the local Supabase stack and separate local and hosted environments, and remove the demo schema and test accounts; architecture agreed. Creating the Netlify site moves to milestone 10.</w:t>
+        <w:t xml:space="preserve"> convert the repository to TypeScript, set up the local Supabase stack and separate local and hosted environments, and remove the demo schema and test accounts; architecture agreed. Creating the Vercel project moves to milestone 10.</w:t>
       </w:r>
     </w:p>
     <w:p>
@@ -1708,7 +1738,7 @@
         <w:t xml:space="preserve">Auth:</w:t>
       </w:r>
       <w:r>
-        <w:t xml:space="preserve"> sign-up, confirmation through Resend SMTP, login/logout, protected routes, session handling, and the profile-provisioning trigger; verified with tests.</w:t>
+        <w:t xml:space="preserve"> sign-up, confirmation emails through custom SMTP, login/logout, protected routes, session handling, and the profile-provisioning trigger; verified with tests.</w:t>
       </w:r>
     </w:p>
     <w:p>
@@ -1852,7 +1882,7 @@
         <w:t xml:space="preserve">Release and mobile preparation:</w:t>
       </w:r>
       <w:r>
-        <w:t xml:space="preserve"> Netlify deployment, security review (including the Supabase security and performance advisors), responsive UI, later PWA/mobile exploration.</w:t>
+        <w:t xml:space="preserve"> Vercel deployment and Gmail SMTP setup, security review (including the Supabase security and performance advisors), responsive UI, later PWA/mobile exploration.</w:t>
       </w:r>
     </w:p>
     <w:p>
@@ -2078,6 +2108,30 @@
     </w:p>
     <w:p>
       <w:pPr>
+        <w:pStyle w:val="ListBullet"/>
+      </w:pPr>
+      <w:r>
+        <w:rPr>
+          <w:b/>
+        </w:rPr>
+        <w:t xml:space="preserve">Hosting and email.</w:t>
+      </w:r>
+      <w:r>
+        <w:t xml:space="preserve"> Decision: Vercel on a free </w:t>
+      </w:r>
+      <w:r>
+        <w:rPr>
+          <w:rFonts w:ascii="Consolas" w:hAnsi="Consolas" w:cs="Consolas"/>
+          <w:sz w:val="20"/>
+        </w:rPr>
+        <w:t xml:space="preserve">*.vercel.app</w:t>
+      </w:r>
+      <w:r>
+        <w:t xml:space="preserve"> address, and Gmail SMTP for auth emails; no domain is needed. The expected scale is two to four people.</w:t>
+      </w:r>
+    </w:p>
+    <w:p>
+      <w:pPr>
         <w:pStyle w:val="Heading2"/>
       </w:pPr>
       <w:r>
@@ -2216,6 +2270,20 @@
       </w:r>
       <w:r>
         <w:t xml:space="preserve"> status and section 10 updated after milestone 2.</w:t>
+      </w:r>
+    </w:p>
+    <w:p>
+      <w:pPr>
+        <w:pStyle w:val="ListBullet"/>
+      </w:pPr>
+      <w:r>
+        <w:rPr>
+          <w:b/>
+        </w:rPr>
+        <w:t xml:space="preserve">v2.3, 15 October 2026:</w:t>
+      </w:r>
+      <w:r>
+        <w:t xml:space="preserve"> hosting changed from Netlify to Vercel and email from Resend to Gmail SMTP; no custom domain needed.</w:t>
       </w:r>
     </w:p>
     <w:p>

</xml_diff>

<commit_message>
Profile picture functionality and upload
</commit_message>
<xml_diff>
--- a/Chat_App_Project_Specification.docx
+++ b/Chat_App_Project_Specification.docx
@@ -18,7 +18,7 @@
         <w:t xml:space="preserve">Status:</w:t>
       </w:r>
       <w:r>
-        <w:t xml:space="preserve"> Revised draft v2.3, 15 October 2026. Milestones 1, 2 and 2b are complete; see docs/PROGRESS.md in the repository for detailed progress.</w:t>
+        <w:t xml:space="preserve"> Revised draft v2.4, 15 October 2026. Milestones 1, 2, 2b and 3 are complete; see docs/PROGRESS.md in the repository for detailed progress.</w:t>
       </w:r>
     </w:p>
     <w:p>
@@ -1903,17 +1903,7 @@
         <w:pStyle w:val="ListBullet"/>
       </w:pPr>
       <w:r>
-        <w:t xml:space="preserve">Milestones 1 (foundation) and 2 (auth) are complete and pushed to </w:t>
-      </w:r>
-      <w:r>
-        <w:rPr>
-          <w:rFonts w:ascii="Consolas" w:hAnsi="Consolas" w:cs="Consolas"/>
-          <w:sz w:val="20"/>
-        </w:rPr>
-        <w:t xml:space="preserve">main</w:t>
-      </w:r>
-      <w:r>
-        <w:t xml:space="preserve">. Detailed progress, open items and next steps live in </w:t>
+        <w:t xml:space="preserve">Milestones 1 (foundation), 2 (auth, including password reset) and 3 (profiles and avatars) are complete. Detailed progress, open items and next steps live in </w:t>
       </w:r>
       <w:r>
         <w:rPr>
@@ -1951,7 +1941,7 @@
         <w:t xml:space="preserve">design/sign-in.png</w:t>
       </w:r>
       <w:r>
-        <w:t xml:space="preserve">), sign up, check email, onboarding, and a home placeholder.</w:t>
+        <w:t xml:space="preserve">), sign up, check email, forgot and reset password, onboarding, profile settings with avatar upload, and a home placeholder.</w:t>
       </w:r>
     </w:p>
     <w:p>
@@ -1969,7 +1959,37 @@
         <w:t xml:space="preserve">profiles</w:t>
       </w:r>
       <w:r>
-        <w:t xml:space="preserve"> with username rules, column-level update grants, RLS and a sign-up trigger. Tests: pgTAP in </w:t>
+        <w:t xml:space="preserve"> with username rules, column-level update grants, RLS and a sign-up trigger; a public </w:t>
+      </w:r>
+      <w:r>
+        <w:rPr>
+          <w:rFonts w:ascii="Consolas" w:hAnsi="Consolas" w:cs="Consolas"/>
+          <w:sz w:val="20"/>
+        </w:rPr>
+        <w:t xml:space="preserve">avatars</w:t>
+      </w:r>
+      <w:r>
+        <w:t xml:space="preserve"> bucket with per-user folder policies and the </w:t>
+      </w:r>
+      <w:r>
+        <w:rPr>
+          <w:rFonts w:ascii="Consolas" w:hAnsi="Consolas" w:cs="Consolas"/>
+          <w:sz w:val="20"/>
+        </w:rPr>
+        <w:t xml:space="preserve">set_avatar</w:t>
+      </w:r>
+      <w:r>
+        <w:t xml:space="preserve"> and </w:t>
+      </w:r>
+      <w:r>
+        <w:rPr>
+          <w:rFonts w:ascii="Consolas" w:hAnsi="Consolas" w:cs="Consolas"/>
+          <w:sz w:val="20"/>
+        </w:rPr>
+        <w:t xml:space="preserve">remove_avatar</w:t>
+      </w:r>
+      <w:r>
+        <w:t xml:space="preserve"> functions. Tests: pgTAP in </w:t>
       </w:r>
       <w:r>
         <w:rPr>
@@ -2007,7 +2027,7 @@
         <w:t xml:space="preserve">npm run dev</w:t>
       </w:r>
       <w:r>
-        <w:t xml:space="preserve"> uses it and Mailpit catches its emails. The hosted project has only the first two migrations: the profiles migration, auth settings and an email sender are applied at deployment.</w:t>
+        <w:t xml:space="preserve"> uses it and Mailpit catches its emails. The hosted project has only the first two migrations: the profiles and avatars migrations and the auth settings are applied at deployment. Gmail SMTP is already configured there.</w:t>
       </w:r>
     </w:p>
     <w:p>
@@ -2284,6 +2304,20 @@
       </w:r>
       <w:r>
         <w:t xml:space="preserve"> status and section 10 updated after milestone 2.</w:t>
+      </w:r>
+    </w:p>
+    <w:p>
+      <w:pPr>
+        <w:pStyle w:val="ListBullet"/>
+      </w:pPr>
+      <w:r>
+        <w:rPr>
+          <w:b/>
+        </w:rPr>
+        <w:t xml:space="preserve">v2.4, 15 October 2026:</w:t>
+      </w:r>
+      <w:r>
+        <w:t xml:space="preserve"> status and section 10 updated after milestone 3.</w:t>
       </w:r>
     </w:p>
     <w:p>

</xml_diff>

<commit_message>
Fruend requests, search and blocking
</commit_message>
<xml_diff>
--- a/Chat_App_Project_Specification.docx
+++ b/Chat_App_Project_Specification.docx
@@ -18,7 +18,7 @@
         <w:t xml:space="preserve">Status:</w:t>
       </w:r>
       <w:r>
-        <w:t xml:space="preserve"> Revised draft v2.4, 15 October 2026. Milestones 1, 2, 2b and 3 are complete; see docs/PROGRESS.md in the repository for detailed progress.</w:t>
+        <w:t xml:space="preserve"> Revised draft v2.5, 16 October 2026. Milestones 1, 2, 2b and 3 are complete and milestone 4 is built; see docs/PROGRESS.md in the repository for detailed progress.</w:t>
       </w:r>
     </w:p>
     <w:p>
@@ -444,7 +444,7 @@
         <w:t xml:space="preserve">Blocking:</w:t>
       </w:r>
       <w:r>
-        <w:t xml:space="preserve"> a user can block another user. Blocking ends any friendship, cancels pending requests between the two, prevents new requests in either direction, and hides the blocker from the blocked user's search results. Conversation history remains, as in rule 7.</w:t>
+        <w:t xml:space="preserve"> a user can block another user. Blocking ends any friendship, cancels pending requests between the two, prevents new requests in either direction, and hides the blocker from the blocked user's search results. The blocker still finds the blocked user in search, marked as blocked, so they can unblock; unblocking does not restore the friendship. Conversation history remains, as in rule 7.</w:t>
       </w:r>
     </w:p>
     <w:p>
@@ -1173,7 +1173,7 @@
         <w:t xml:space="preserve">conversation_members</w:t>
       </w:r>
       <w:r>
-        <w:t xml:space="preserve"> alone could not express this. The conversation is created inside the accept transaction: the function locks the request row (SELECT … FOR UPDATE), checks that the caller is the recipient and the status is pending, inserts the friendship, creates the conversation, mapping and both membership rows only if the pair has none (relying on the unique constraint via INSERT … ON CONFLICT DO NOTHING rather than a prior SELECT), and marks the request accepted. Re-friending finds the existing conversation.</w:t>
+        <w:t xml:space="preserve"> alone could not express this. The conversation is created inside the accept transaction: the function takes a transaction-scoped advisory lock on the sorted pair of user ids (a row lock cannot cover a request that does not exist yet, as when both users send at the same moment), re-reads the request, checks that the caller is the recipient and the status is pending, inserts the friendship, creates the conversation, mapping and both membership rows only if the pair has none (relying on the unique constraint via INSERT … ON CONFLICT DO NOTHING rather than a prior SELECT), and marks the request accepted. Re-friending finds the existing conversation.</w:t>
       </w:r>
     </w:p>
     <w:p>
@@ -1296,7 +1296,7 @@
         <w:t xml:space="preserve">conversation_members</w:t>
       </w:r>
       <w:r>
-        <w:t xml:space="preserve"> directly. Those privileges are revoked from the authenticated role, and every change goes through SECURITY DEFINER functions: send_friend_request, respond_to_friend_request, cancel_friend_request, unfriend and block_user. Status transitions (pending → accepted, declined or cancelled, and nothing else) are enforced inside those functions; a CHECK constraint can restrict values but not transitions. Text messages are inserted directly by the client under RLS.</w:t>
+        <w:t xml:space="preserve"> directly. Those privileges are revoked from the authenticated role, and every change goes through SECURITY DEFINER functions: send_friend_request, respond_to_friend_request, cancel_friend_request, unfriend, block_user and unblock_user. Username search goes through search_users, which applies the limits in section 11 and the block rule. Status transitions (pending → accepted, declined or cancelled, and nothing else) are enforced inside those functions; a CHECK constraint can restrict values but not transitions. Text messages are inserted directly by the client under RLS.</w:t>
       </w:r>
     </w:p>
     <w:p>
@@ -1903,7 +1903,7 @@
         <w:pStyle w:val="ListBullet"/>
       </w:pPr>
       <w:r>
-        <w:t xml:space="preserve">Milestones 1 (foundation), 2 (auth, including password reset) and 3 (profiles and avatars) are complete. Detailed progress, open items and next steps live in </w:t>
+        <w:t xml:space="preserve">Milestones 1 (foundation), 2 (auth, including password reset) and 3 (profiles and avatars) are complete; milestone 4 (search, friend requests and blocking) is built. Detailed progress, open items and next steps live in </w:t>
       </w:r>
       <w:r>
         <w:rPr>
@@ -1941,7 +1941,7 @@
         <w:t xml:space="preserve">design/sign-in.png</w:t>
       </w:r>
       <w:r>
-        <w:t xml:space="preserve">), sign up, check email, forgot and reset password, onboarding, profile settings with avatar upload, and a home placeholder.</w:t>
+        <w:t xml:space="preserve">), sign up, check email, forgot and reset password, onboarding, profile settings with avatar upload, people search, friend requests, public profiles with blocking, and a home placeholder.</w:t>
       </w:r>
     </w:p>
     <w:p>
@@ -1989,7 +1989,37 @@
         <w:t xml:space="preserve">remove_avatar</w:t>
       </w:r>
       <w:r>
-        <w:t xml:space="preserve"> functions. Tests: pgTAP in </w:t>
+        <w:t xml:space="preserve"> functions; </w:t>
+      </w:r>
+      <w:r>
+        <w:rPr>
+          <w:rFonts w:ascii="Consolas" w:hAnsi="Consolas" w:cs="Consolas"/>
+          <w:sz w:val="20"/>
+        </w:rPr>
+        <w:t xml:space="preserve">friend_requests</w:t>
+      </w:r>
+      <w:r>
+        <w:t xml:space="preserve">, </w:t>
+      </w:r>
+      <w:r>
+        <w:rPr>
+          <w:rFonts w:ascii="Consolas" w:hAnsi="Consolas" w:cs="Consolas"/>
+          <w:sz w:val="20"/>
+        </w:rPr>
+        <w:t xml:space="preserve">friendships</w:t>
+      </w:r>
+      <w:r>
+        <w:t xml:space="preserve"> and </w:t>
+      </w:r>
+      <w:r>
+        <w:rPr>
+          <w:rFonts w:ascii="Consolas" w:hAnsi="Consolas" w:cs="Consolas"/>
+          <w:sz w:val="20"/>
+        </w:rPr>
+        <w:t xml:space="preserve">blocks</w:t>
+      </w:r>
+      <w:r>
+        <w:t xml:space="preserve">, read-only to clients, changed through security-definer functions that serialise each pair with an advisory lock. Tests: pgTAP in </w:t>
       </w:r>
       <w:r>
         <w:rPr>
@@ -1999,6 +2029,16 @@
         <w:t xml:space="preserve">supabase/tests/database</w:t>
       </w:r>
       <w:r>
+        <w:t xml:space="preserve">, a two-session race check in </w:t>
+      </w:r>
+      <w:r>
+        <w:rPr>
+          <w:rFonts w:ascii="Consolas" w:hAnsi="Consolas" w:cs="Consolas"/>
+          <w:sz w:val="20"/>
+        </w:rPr>
+        <w:t xml:space="preserve">scripts/db/race.sh</w:t>
+      </w:r>
+      <w:r>
         <w:t xml:space="preserve">, Vitest in </w:t>
       </w:r>
       <w:r>
@@ -2027,7 +2067,7 @@
         <w:t xml:space="preserve">npm run dev</w:t>
       </w:r>
       <w:r>
-        <w:t xml:space="preserve"> uses it and Mailpit catches its emails. The hosted project has only the first two migrations: the profiles and avatars migrations and the auth settings are applied at deployment. Gmail SMTP is already configured there.</w:t>
+        <w:t xml:space="preserve"> uses it and Mailpit catches its emails. The hosted project has only the first two migrations: the later migrations and the auth settings are applied at deployment. Gmail SMTP is already configured there.</w:t>
       </w:r>
     </w:p>
     <w:p>
@@ -2162,6 +2202,48 @@
         <w:rPr>
           <w:b/>
         </w:rPr>
+        <w:t xml:space="preserve">Search behaviour.</w:t>
+      </w:r>
+      <w:r>
+        <w:t xml:space="preserve"> Decision (milestone 4): prefix match on username, minimum 3 characters, at most 20 results, 30 searches a minute per user.</w:t>
+      </w:r>
+    </w:p>
+    <w:p>
+      <w:pPr>
+        <w:pStyle w:val="ListBullet"/>
+      </w:pPr>
+      <w:r>
+        <w:rPr>
+          <w:b/>
+        </w:rPr>
+        <w:t xml:space="preserve">Request limits.</w:t>
+      </w:r>
+      <w:r>
+        <w:t xml:space="preserve"> Decision (milestone 4): at most 20 requests an hour per user; after a decline, the same requester may ask that person again after 24 hours.</w:t>
+      </w:r>
+    </w:p>
+    <w:p>
+      <w:pPr>
+        <w:pStyle w:val="ListBullet"/>
+      </w:pPr>
+      <w:r>
+        <w:rPr>
+          <w:b/>
+        </w:rPr>
+        <w:t xml:space="preserve">Blocks and profile reads.</w:t>
+      </w:r>
+      <w:r>
+        <w:t xml:space="preserve"> Decision (milestone 4): a block hides the blocker from search, but profiles stay readable by any signed-in user, so the blocked user can still open the blocker's profile by its address. Hiding it would also hide the name on kept conversation history.</w:t>
+      </w:r>
+    </w:p>
+    <w:p>
+      <w:pPr>
+        <w:pStyle w:val="ListBullet"/>
+      </w:pPr>
+      <w:r>
+        <w:rPr>
+          <w:b/>
+        </w:rPr>
         <w:t xml:space="preserve">Hosting and email.</w:t>
       </w:r>
       <w:r>
@@ -2208,10 +2290,46 @@
         <w:rPr>
           <w:b/>
         </w:rPr>
-        <w:t xml:space="preserve">Search behaviour.</w:t>
-      </w:r>
-      <w:r>
-        <w:t xml:space="preserve"> Recommendation: prefix match on username, minimum 3 characters, at most 20 results.</w:t>
+        <w:t xml:space="preserve">Request expiration.</w:t>
+      </w:r>
+      <w:r>
+        <w:t xml:space="preserve"> Recommendation: none for the MVP.</w:t>
+      </w:r>
+    </w:p>
+    <w:p>
+      <w:r>
+        <w:t xml:space="preserve">Resolved in this revision: frontend tooling (React + TypeScript with Vite), when a conversation is created (on acceptance), and the direct-conversation pair schema (</w:t>
+      </w:r>
+      <w:r>
+        <w:rPr>
+          <w:rFonts w:ascii="Consolas" w:hAnsi="Consolas" w:cs="Consolas"/>
+          <w:sz w:val="20"/>
+        </w:rPr>
+        <w:t xml:space="preserve">direct_conversations</w:t>
+      </w:r>
+      <w:r>
+        <w:t xml:space="preserve">).</w:t>
+      </w:r>
+    </w:p>
+    <w:p>
+      <w:pPr>
+        <w:pStyle w:val="Heading1"/>
+      </w:pPr>
+      <w:r>
+        <w:t xml:space="preserve">12. Instructions to Claude — first response</w:t>
+      </w:r>
+    </w:p>
+    <w:p>
+      <w:r>
+        <w:t xml:space="preserve">Do not start coding immediately. Section 5 contains a proposed schema. The schema decisions in section 11 are decided. Check the schema against those decisions and the rules in section 3 for inconsistencies, missing functional dependencies, authorization gaps, and normalization problems. Present the resulting tables, keys, constraints, indexes, transaction boundaries, and RLS policy outline, clearly separating confirmed rules from unresolved decisions. Ask for approval before writing migrations or application code. Teach the reasoning rather than simply providing generated code.</w:t>
+      </w:r>
+    </w:p>
+    <w:p>
+      <w:pPr>
+        <w:pStyle w:val="Heading1"/>
+      </w:pPr>
+      <w:r>
+        <w:t xml:space="preserve">Revision history</w:t>
       </w:r>
     </w:p>
     <w:p>
@@ -2222,46 +2340,10 @@
         <w:rPr>
           <w:b/>
         </w:rPr>
-        <w:t xml:space="preserve">Request expiration.</w:t>
-      </w:r>
-      <w:r>
-        <w:t xml:space="preserve"> Recommendation: none for the MVP.</w:t>
-      </w:r>
-    </w:p>
-    <w:p>
-      <w:r>
-        <w:t xml:space="preserve">Resolved in this revision: frontend tooling (React + TypeScript with Vite), when a conversation is created (on acceptance), and the direct-conversation pair schema (</w:t>
-      </w:r>
-      <w:r>
-        <w:rPr>
-          <w:rFonts w:ascii="Consolas" w:hAnsi="Consolas" w:cs="Consolas"/>
-          <w:sz w:val="20"/>
-        </w:rPr>
-        <w:t xml:space="preserve">direct_conversations</w:t>
-      </w:r>
-      <w:r>
-        <w:t xml:space="preserve">).</w:t>
-      </w:r>
-    </w:p>
-    <w:p>
-      <w:pPr>
-        <w:pStyle w:val="Heading1"/>
-      </w:pPr>
-      <w:r>
-        <w:t xml:space="preserve">12. Instructions to Claude — first response</w:t>
-      </w:r>
-    </w:p>
-    <w:p>
-      <w:r>
-        <w:t xml:space="preserve">Do not start coding immediately. Section 5 contains a proposed schema. The schema decisions in section 11 are decided. Check the schema against those decisions and the rules in section 3 for inconsistencies, missing functional dependencies, authorization gaps, and normalization problems. Present the resulting tables, keys, constraints, indexes, transaction boundaries, and RLS policy outline, clearly separating confirmed rules from unresolved decisions. Ask for approval before writing migrations or application code. Teach the reasoning rather than simply providing generated code.</w:t>
-      </w:r>
-    </w:p>
-    <w:p>
-      <w:pPr>
-        <w:pStyle w:val="Heading1"/>
-      </w:pPr>
-      <w:r>
-        <w:t xml:space="preserve">Revision history</w:t>
+        <w:t xml:space="preserve">v2, 15 October 2026:</w:t>
+      </w:r>
+      <w:r>
+        <w:t xml:space="preserve"> resolved contradictions (profile provisioning, friendship state, conversation type), added a concrete schema with blocking and idempotent sends, defined write paths and the recovery strategy, documented the current repository state, sorted open decisions by urgency with recommendations, and fixed numbered lists so each one starts at 1.</w:t>
       </w:r>
     </w:p>
     <w:p>
@@ -2272,10 +2354,10 @@
         <w:rPr>
           <w:b/>
         </w:rPr>
-        <w:t xml:space="preserve">v2, 15 October 2026:</w:t>
-      </w:r>
-      <w:r>
-        <w:t xml:space="preserve"> resolved contradictions (profile provisioning, friendship state, conversation type), added a concrete schema with blocking and idempotent sends, defined write paths and the recovery strategy, documented the current repository state, sorted open decisions by urgency with recommendations, and fixed numbered lists so each one starts at 1.</w:t>
+        <w:t xml:space="preserve">v2.1, 15 October 2026:</w:t>
+      </w:r>
+      <w:r>
+        <w:t xml:space="preserve"> the developer accepted the five schema decisions in section 11 and the rules in section 3; section 10 updated after milestone 1.</w:t>
       </w:r>
     </w:p>
     <w:p>
@@ -2286,10 +2368,10 @@
         <w:rPr>
           <w:b/>
         </w:rPr>
-        <w:t xml:space="preserve">v2.1, 15 October 2026:</w:t>
-      </w:r>
-      <w:r>
-        <w:t xml:space="preserve"> the developer accepted the five schema decisions in section 11 and the rules in section 3; section 10 updated after milestone 1.</w:t>
+        <w:t xml:space="preserve">v2.2, 15 October 2026:</w:t>
+      </w:r>
+      <w:r>
+        <w:t xml:space="preserve"> status and section 10 updated after milestone 2.</w:t>
       </w:r>
     </w:p>
     <w:p>
@@ -2300,10 +2382,10 @@
         <w:rPr>
           <w:b/>
         </w:rPr>
-        <w:t xml:space="preserve">v2.2, 15 October 2026:</w:t>
-      </w:r>
-      <w:r>
-        <w:t xml:space="preserve"> status and section 10 updated after milestone 2.</w:t>
+        <w:t xml:space="preserve">v2.4, 15 October 2026:</w:t>
+      </w:r>
+      <w:r>
+        <w:t xml:space="preserve"> status and section 10 updated after milestone 3.</w:t>
       </w:r>
     </w:p>
     <w:p>
@@ -2314,10 +2396,10 @@
         <w:rPr>
           <w:b/>
         </w:rPr>
-        <w:t xml:space="preserve">v2.4, 15 October 2026:</w:t>
-      </w:r>
-      <w:r>
-        <w:t xml:space="preserve"> status and section 10 updated after milestone 3.</w:t>
+        <w:t xml:space="preserve">v2.5, 16 October 2026:</w:t>
+      </w:r>
+      <w:r>
+        <w:t xml:space="preserve"> milestone 4: search and request limits decided, blocked users stay visible to the blocker, pair locking described, section 10 updated.</w:t>
       </w:r>
     </w:p>
     <w:p>

</xml_diff>

<commit_message>
Added feature of Home and unfriend
</commit_message>
<xml_diff>
--- a/Chat_App_Project_Specification.docx
+++ b/Chat_App_Project_Specification.docx
@@ -18,7 +18,7 @@
         <w:t xml:space="preserve">Status:</w:t>
       </w:r>
       <w:r>
-        <w:t xml:space="preserve"> Revised draft v2.5, 16 October 2026. Milestones 1, 2, 2b and 3 are complete and milestone 4 is built; see docs/PROGRESS.md in the repository for detailed progress.</w:t>
+        <w:t xml:space="preserve"> Revised draft v2.6, 16 October 2026. Milestones 1–4 are complete and milestone 5 is built; see docs/PROGRESS.md in the repository for detailed progress.</w:t>
       </w:r>
     </w:p>
     <w:p>
@@ -995,7 +995,7 @@
           </w:tcPr>
           <w:p>
             <w:r>
-              <w:t xml:space="preserve">PK conversation_id; FK → conversations; FKs → profiles; UNIQUE (user_low_id, user_high_id); CHECK user_low_id &lt; user_high_id</w:t>
+              <w:t xml:space="preserve">PK conversation_id; FK → conversations; FKs → profiles ON DELETE SET NULL, so a deleted account leaves the other person a direct conversation with "Deleted user"; UNIQUE (user_low_id, user_high_id); CHECK user_low_id &lt; user_high_id</w:t>
             </w:r>
           </w:p>
         </w:tc>
@@ -1031,7 +1031,7 @@
           </w:tcPr>
           <w:p>
             <w:r>
-              <w:t xml:space="preserve">PK (conversation_id, user_id); FKs → conversations, profiles; last_read_message_id nullable, reserved for unread counts and read receipts</w:t>
+              <w:t xml:space="preserve">PK (conversation_id, user_id); FKs → conversations, profiles (ON DELETE CASCADE); last_read_message_id nullable, reserved for unread counts and read receipts. When the last member is removed, a trigger deletes the conversation</w:t>
             </w:r>
           </w:p>
         </w:tc>
@@ -1173,7 +1173,7 @@
         <w:t xml:space="preserve">conversation_members</w:t>
       </w:r>
       <w:r>
-        <w:t xml:space="preserve"> alone could not express this. The conversation is created inside the accept transaction: the function takes a transaction-scoped advisory lock on the sorted pair of user ids (a row lock cannot cover a request that does not exist yet, as when both users send at the same moment), re-reads the request, checks that the caller is the recipient and the status is pending, inserts the friendship, creates the conversation, mapping and both membership rows only if the pair has none (relying on the unique constraint via INSERT … ON CONFLICT DO NOTHING rather than a prior SELECT), and marks the request accepted. Re-friending finds the existing conversation.</w:t>
+        <w:t xml:space="preserve"> alone could not express this. The conversation is created inside the accept transaction: the function takes a transaction-scoped advisory lock on the sorted pair of user ids (a row lock cannot cover a request that does not exist yet, as when both users send at the same moment), re-reads the request, checks that the caller is the recipient and the status is pending, inserts the friendship, looks up the pair's conversation and creates the conversation, mapping and both membership rows only if there is none, and marks the request accepted. Under the pair lock this look-then-insert is safe; the unique constraint is the backstop. (INSERT … ON CONFLICT DO NOTHING on the mapping alone would leave an empty conversation behind, since the conversation row is inserted first.) Re-friending finds the existing conversation.</w:t>
       </w:r>
     </w:p>
     <w:p>
@@ -1903,7 +1903,7 @@
         <w:pStyle w:val="ListBullet"/>
       </w:pPr>
       <w:r>
-        <w:t xml:space="preserve">Milestones 1 (foundation), 2 (auth, including password reset) and 3 (profiles and avatars) are complete; milestone 4 (search, friend requests and blocking) is built. Detailed progress, open items and next steps live in </w:t>
+        <w:t xml:space="preserve">Milestones 1 (foundation), 2 (auth, including password reset), 3 (profiles and avatars) and 4 (search, friend requests and blocking) are complete; milestone 5 (friend list, unfriend, conversation on accept) is built. Detailed progress, open items and next steps live in </w:t>
       </w:r>
       <w:r>
         <w:rPr>
@@ -1941,7 +1941,7 @@
         <w:t xml:space="preserve">design/sign-in.png</w:t>
       </w:r>
       <w:r>
-        <w:t xml:space="preserve">), sign up, check email, forgot and reset password, onboarding, profile settings with avatar upload, people search, friend requests, public profiles with blocking, and a home placeholder.</w:t>
+        <w:t xml:space="preserve">), sign up, check email, forgot and reset password, onboarding, profile settings with avatar upload, people search, friend requests, public profiles with unfriend and block, and a home screen listing your friends.</w:t>
       </w:r>
     </w:p>
     <w:p>
@@ -2019,7 +2019,37 @@
         <w:t xml:space="preserve">blocks</w:t>
       </w:r>
       <w:r>
-        <w:t xml:space="preserve">, read-only to clients, changed through security-definer functions that serialise each pair with an advisory lock. Tests: pgTAP in </w:t>
+        <w:t xml:space="preserve">, read-only to clients, changed through security-definer functions that serialise each pair with an advisory lock; </w:t>
+      </w:r>
+      <w:r>
+        <w:rPr>
+          <w:rFonts w:ascii="Consolas" w:hAnsi="Consolas" w:cs="Consolas"/>
+          <w:sz w:val="20"/>
+        </w:rPr>
+        <w:t xml:space="preserve">conversations</w:t>
+      </w:r>
+      <w:r>
+        <w:t xml:space="preserve">, </w:t>
+      </w:r>
+      <w:r>
+        <w:rPr>
+          <w:rFonts w:ascii="Consolas" w:hAnsi="Consolas" w:cs="Consolas"/>
+          <w:sz w:val="20"/>
+        </w:rPr>
+        <w:t xml:space="preserve">direct_conversations</w:t>
+      </w:r>
+      <w:r>
+        <w:t xml:space="preserve"> and </w:t>
+      </w:r>
+      <w:r>
+        <w:rPr>
+          <w:rFonts w:ascii="Consolas" w:hAnsi="Consolas" w:cs="Consolas"/>
+          <w:sz w:val="20"/>
+        </w:rPr>
+        <w:t xml:space="preserve">conversation_members</w:t>
+      </w:r>
+      <w:r>
+        <w:t xml:space="preserve">, readable by members through a security-definer membership check, created when a request is accepted. Tests: pgTAP in </w:t>
       </w:r>
       <w:r>
         <w:rPr>
@@ -2230,6 +2260,30 @@
         <w:rPr>
           <w:b/>
         </w:rPr>
+        <w:t xml:space="preserve">Conversations after account deletion.</w:t>
+      </w:r>
+      <w:r>
+        <w:t xml:space="preserve"> Decision (milestone 5): the deleted user's side of </w:t>
+      </w:r>
+      <w:r>
+        <w:rPr>
+          <w:rFonts w:ascii="Consolas" w:hAnsi="Consolas" w:cs="Consolas"/>
+          <w:sz w:val="20"/>
+        </w:rPr>
+        <w:t xml:space="preserve">direct_conversations</w:t>
+      </w:r>
+      <w:r>
+        <w:t xml:space="preserve"> becomes null and their membership goes; the other person keeps the conversation, shown with "Deleted user". When both have deleted their accounts, the conversation is deleted.</w:t>
+      </w:r>
+    </w:p>
+    <w:p>
+      <w:pPr>
+        <w:pStyle w:val="ListBullet"/>
+      </w:pPr>
+      <w:r>
+        <w:rPr>
+          <w:b/>
+        </w:rPr>
         <w:t xml:space="preserve">Blocks and profile reads.</w:t>
       </w:r>
       <w:r>
@@ -2400,6 +2454,20 @@
       </w:r>
       <w:r>
         <w:t xml:space="preserve"> milestone 4: search and request limits decided, blocked users stay visible to the blocker, pair locking described, section 10 updated.</w:t>
+      </w:r>
+    </w:p>
+    <w:p>
+      <w:pPr>
+        <w:pStyle w:val="ListBullet"/>
+      </w:pPr>
+      <w:r>
+        <w:rPr>
+          <w:b/>
+        </w:rPr>
+        <w:t xml:space="preserve">v2.6, 16 October 2026:</w:t>
+      </w:r>
+      <w:r>
+        <w:t xml:space="preserve"> milestone 5: delete rules for direct conversations and memberships, look-then-insert under the pair lock, empty conversations deleted, section 10 updated.</w:t>
       </w:r>
     </w:p>
     <w:p>

</xml_diff>

<commit_message>
Direct messages and chat list
Milestone 6. Friends send text messages in their conversation; members
read the history, which stays after unfriending, blocking or one account
being deleted ("Deleted user"). Clients insert only conversation_id,
client_id and content, so sender, time and id come from the database, and
UNIQUE (sender_id, client_id) makes retries safe. Keyset paging through
messages_page; Home becomes the chat list (my_conversations), including
read-only conversations; chat screen with load older, retry and a
read-only note. Spec v2.7.
</commit_message>
<xml_diff>
--- a/Chat_App_Project_Specification.docx
+++ b/Chat_App_Project_Specification.docx
@@ -18,7 +18,7 @@
         <w:t xml:space="preserve">Status:</w:t>
       </w:r>
       <w:r>
-        <w:t xml:space="preserve"> Revised draft v2.6, 16 October 2026. Milestones 1–4 are complete and milestone 5 is built; see docs/PROGRESS.md in the repository for detailed progress.</w:t>
+        <w:t xml:space="preserve"> Revised draft v2.7, 16 October 2026. Milestones 1–5 are complete and milestone 6 is built; see docs/PROGRESS.md in the repository for detailed progress.</w:t>
       </w:r>
     </w:p>
     <w:p>
@@ -1067,7 +1067,7 @@
           </w:tcPr>
           <w:p>
             <w:r>
-              <w:t xml:space="preserve">PK id (bigint identity); FK → conversations; composite FK (conversation_id, sender_id) → conversation_members; UNIQUE (sender_id, client_id); content nullable, 1–4,000 chars when present; INDEX (conversation_id, created_at DESC, id DESC)</w:t>
+              <w:t xml:space="preserve">PK id (bigint identity); FK → conversations ON DELETE CASCADE; composite FK (conversation_id, sender_id) → conversation_members ON DELETE SET NULL (sender_id); sender_id defaults to auth.uid(); UNIQUE (sender_id, client_id); content nullable, 1–4,000 chars with a non-space character when present; INDEX (conversation_id, created_at DESC, id DESC)</w:t>
             </w:r>
           </w:p>
         </w:tc>
@@ -1296,7 +1296,7 @@
         <w:t xml:space="preserve">conversation_members</w:t>
       </w:r>
       <w:r>
-        <w:t xml:space="preserve"> directly. Those privileges are revoked from the authenticated role, and every change goes through SECURITY DEFINER functions: send_friend_request, respond_to_friend_request, cancel_friend_request, unfriend, block_user and unblock_user. Username search goes through search_users, which applies the limits in section 11 and the block rule. Status transitions (pending → accepted, declined or cancelled, and nothing else) are enforced inside those functions; a CHECK constraint can restrict values but not transitions. Text messages are inserted directly by the client under RLS.</w:t>
+        <w:t xml:space="preserve"> directly. Those privileges are revoked from the authenticated role, and every change goes through SECURITY DEFINER functions: send_friend_request, respond_to_friend_request, cancel_friend_request, unfriend, block_user and unblock_user. Username search goes through search_users, which applies the limits in section 11 and the block rule. Status transitions (pending → accepted, declined or cancelled, and nothing else) are enforced inside those functions; a CHECK constraint can restrict values but not transitions. Text messages are inserted directly by the client under RLS, with an insert grant on conversation_id, client_id and content only: sender_id, created_at and id always come from the database.</w:t>
       </w:r>
     </w:p>
     <w:p>
@@ -1903,7 +1903,7 @@
         <w:pStyle w:val="ListBullet"/>
       </w:pPr>
       <w:r>
-        <w:t xml:space="preserve">Milestones 1 (foundation), 2 (auth, including password reset), 3 (profiles and avatars) and 4 (search, friend requests and blocking) are complete; milestone 5 (friend list, unfriend, conversation on accept) is built. Detailed progress, open items and next steps live in </w:t>
+        <w:t xml:space="preserve">Milestones 1 (foundation), 2 (auth, including password reset), 3 (profiles and avatars) 4 (search, friend requests and blocking) and 5 (friendships and conversations) are complete; milestone 6 (persistent direct messages) is built. Detailed progress, open items and next steps live in </w:t>
       </w:r>
       <w:r>
         <w:rPr>
@@ -1941,7 +1941,7 @@
         <w:t xml:space="preserve">design/sign-in.png</w:t>
       </w:r>
       <w:r>
-        <w:t xml:space="preserve">), sign up, check email, forgot and reset password, onboarding, profile settings with avatar upload, people search, friend requests, public profiles with unfriend and block, and a home screen listing your friends.</w:t>
+        <w:t xml:space="preserve">), sign up, check email, forgot and reset password, onboarding, profile settings with avatar upload, people search, friend requests, public profiles with unfriend and block, a home screen listing your chats, and a chat screen with history paging.</w:t>
       </w:r>
     </w:p>
     <w:p>
@@ -2049,7 +2049,37 @@
         <w:t xml:space="preserve">conversation_members</w:t>
       </w:r>
       <w:r>
-        <w:t xml:space="preserve">, readable by members through a security-definer membership check, created when a request is accepted. Tests: pgTAP in </w:t>
+        <w:t xml:space="preserve">, readable by members through a security-definer membership check, created when a request is accepted; </w:t>
+      </w:r>
+      <w:r>
+        <w:rPr>
+          <w:rFonts w:ascii="Consolas" w:hAnsi="Consolas" w:cs="Consolas"/>
+          <w:sz w:val="20"/>
+        </w:rPr>
+        <w:t xml:space="preserve">messages</w:t>
+      </w:r>
+      <w:r>
+        <w:t xml:space="preserve">, sent by friends under RLS and read by members, with keyset paging (</w:t>
+      </w:r>
+      <w:r>
+        <w:rPr>
+          <w:rFonts w:ascii="Consolas" w:hAnsi="Consolas" w:cs="Consolas"/>
+          <w:sz w:val="20"/>
+        </w:rPr>
+        <w:t xml:space="preserve">messages_page</w:t>
+      </w:r>
+      <w:r>
+        <w:t xml:space="preserve">) and a chat list (</w:t>
+      </w:r>
+      <w:r>
+        <w:rPr>
+          <w:rFonts w:ascii="Consolas" w:hAnsi="Consolas" w:cs="Consolas"/>
+          <w:sz w:val="20"/>
+        </w:rPr>
+        <w:t xml:space="preserve">my_conversations</w:t>
+      </w:r>
+      <w:r>
+        <w:t xml:space="preserve">). Tests: pgTAP in </w:t>
       </w:r>
       <w:r>
         <w:rPr>
@@ -2260,6 +2290,34 @@
         <w:rPr>
           <w:b/>
         </w:rPr>
+        <w:t xml:space="preserve">Home screen.</w:t>
+      </w:r>
+      <w:r>
+        <w:t xml:space="preserve"> Decision (milestone 6): Home lists every conversation you are in, newest activity first, including read-only ones with former friends and deleted accounts, so kept history stays reachable.</w:t>
+      </w:r>
+    </w:p>
+    <w:p>
+      <w:pPr>
+        <w:pStyle w:val="ListBullet"/>
+      </w:pPr>
+      <w:r>
+        <w:rPr>
+          <w:b/>
+        </w:rPr>
+        <w:t xml:space="preserve">Message rate limit.</w:t>
+      </w:r>
+      <w:r>
+        <w:t xml:space="preserve"> Decision (milestone 6): none for now; only friends can send, and unfriending or blocking stops it at once.</w:t>
+      </w:r>
+    </w:p>
+    <w:p>
+      <w:pPr>
+        <w:pStyle w:val="ListBullet"/>
+      </w:pPr>
+      <w:r>
+        <w:rPr>
+          <w:b/>
+        </w:rPr>
         <w:t xml:space="preserve">Conversations after account deletion.</w:t>
       </w:r>
       <w:r>
@@ -2468,6 +2526,20 @@
       </w:r>
       <w:r>
         <w:t xml:space="preserve"> milestone 5: delete rules for direct conversations and memberships, look-then-insert under the pair lock, empty conversations deleted, section 10 updated.</w:t>
+      </w:r>
+    </w:p>
+    <w:p>
+      <w:pPr>
+        <w:pStyle w:val="ListBullet"/>
+      </w:pPr>
+      <w:r>
+        <w:rPr>
+          <w:b/>
+        </w:rPr>
+        <w:t xml:space="preserve">v2.7, 16 October 2026:</w:t>
+      </w:r>
+      <w:r>
+        <w:t xml:space="preserve"> milestone 6: message delete rules and insert grants, Home as the chat list, no message rate limit, section 10 updated.</w:t>
       </w:r>
     </w:p>
     <w:p>

</xml_diff>

<commit_message>
Live messages, requests and reconnect recovery
Milestone 7. Supabase Realtime (postgres_changes) delivers new messages to
an open chat and to Home, and friend requests to the Requests page and the
header badge; RLS decides who receives each insert or update. Only
messages and friend_requests are published: Realtime sends DELETE events
with the old primary key to every subscriber, so tables keyed by user ids
stay out (pinned by realtime.test.sql). The app catches up when changes
start flowing (Realtime's system message, not SUBSCRIBED), on reconnect,
tab focus and coming back online, merging the newest page by id and
restarting from it after a gap of more than a page. Adds a Realtime RLS
check against the running service (npm run db:realtime) and two-browser
e2e tests. Spec v2.8.
</commit_message>
<xml_diff>
--- a/Chat_App_Project_Specification.docx
+++ b/Chat_App_Project_Specification.docx
@@ -18,7 +18,7 @@
         <w:t xml:space="preserve">Status:</w:t>
       </w:r>
       <w:r>
-        <w:t xml:space="preserve"> Revised draft v2.7, 16 October 2026. Milestones 1–5 are complete and milestone 6 is built; see docs/PROGRESS.md in the repository for detailed progress.</w:t>
+        <w:t xml:space="preserve"> Revised draft v2.8, 16 October 2026. Milestones 1–6 are complete and milestone 7 is built; see docs/PROGRESS.md in the repository for detailed progress.</w:t>
       </w:r>
     </w:p>
     <w:p>
@@ -1561,7 +1561,7 @@
         <w:t xml:space="preserve">postgres_changes</w:t>
       </w:r>
       <w:r>
-        <w:t xml:space="preserve"> applies the table's SELECT policy to each subscriber, so message delivery follows read access automatically. Broadcast and Presence do not; if they are used for typing indicators or online status, they must use private channels with policies on </w:t>
+        <w:t xml:space="preserve"> applies the table's SELECT policy to each subscriber for inserts and updates, so message delivery follows read access automatically. DELETE events cannot be checked and reach every subscriber with the old primary key, which limits which tables may be published (section 11). Broadcast and Presence do not; if they are used for typing indicators or online status, they must use private channels with policies on </w:t>
       </w:r>
       <w:r>
         <w:rPr>
@@ -1903,7 +1903,7 @@
         <w:pStyle w:val="ListBullet"/>
       </w:pPr>
       <w:r>
-        <w:t xml:space="preserve">Milestones 1 (foundation), 2 (auth, including password reset), 3 (profiles and avatars) 4 (search, friend requests and blocking) and 5 (friendships and conversations) are complete; milestone 6 (persistent direct messages) is built. Detailed progress, open items and next steps live in </w:t>
+        <w:t xml:space="preserve">Milestones 1 (foundation), 2 (auth, including password reset), 3 (profiles and avatars) 4 (search, friend requests and blocking) and 5 (friendships and conversations) and 6 (persistent direct messages) are complete; milestone 7 (realtime delivery and recovery) is built. Detailed progress, open items and next steps live in </w:t>
       </w:r>
       <w:r>
         <w:rPr>
@@ -1941,7 +1941,7 @@
         <w:t xml:space="preserve">design/sign-in.png</w:t>
       </w:r>
       <w:r>
-        <w:t xml:space="preserve">), sign up, check email, forgot and reset password, onboarding, profile settings with avatar upload, people search, friend requests, public profiles with unfriend and block, a home screen listing your chats, and a chat screen with history paging.</w:t>
+        <w:t xml:space="preserve">), sign up, check email, forgot and reset password, onboarding, profile settings with avatar upload, people search, friend requests, public profiles with unfriend and block, a home screen listing your chats, and a chat screen with history paging; messages, chat previews and friend requests update live.</w:t>
       </w:r>
     </w:p>
     <w:p>
@@ -2079,7 +2079,37 @@
         <w:t xml:space="preserve">my_conversations</w:t>
       </w:r>
       <w:r>
-        <w:t xml:space="preserve">). Tests: pgTAP in </w:t>
+        <w:t xml:space="preserve">); </w:t>
+      </w:r>
+      <w:r>
+        <w:rPr>
+          <w:rFonts w:ascii="Consolas" w:hAnsi="Consolas" w:cs="Consolas"/>
+          <w:sz w:val="20"/>
+        </w:rPr>
+        <w:t xml:space="preserve">messages</w:t>
+      </w:r>
+      <w:r>
+        <w:t xml:space="preserve"> and </w:t>
+      </w:r>
+      <w:r>
+        <w:rPr>
+          <w:rFonts w:ascii="Consolas" w:hAnsi="Consolas" w:cs="Consolas"/>
+          <w:sz w:val="20"/>
+        </w:rPr>
+        <w:t xml:space="preserve">friend_requests</w:t>
+      </w:r>
+      <w:r>
+        <w:t xml:space="preserve"> in the </w:t>
+      </w:r>
+      <w:r>
+        <w:rPr>
+          <w:rFonts w:ascii="Consolas" w:hAnsi="Consolas" w:cs="Consolas"/>
+          <w:sz w:val="20"/>
+        </w:rPr>
+        <w:t xml:space="preserve">supabase_realtime</w:t>
+      </w:r>
+      <w:r>
+        <w:t xml:space="preserve"> publication. Tests: pgTAP in </w:t>
       </w:r>
       <w:r>
         <w:rPr>
@@ -2099,6 +2129,16 @@
         <w:t xml:space="preserve">scripts/db/race.sh</w:t>
       </w:r>
       <w:r>
+        <w:t xml:space="preserve">, a Realtime RLS check in </w:t>
+      </w:r>
+      <w:r>
+        <w:rPr>
+          <w:rFonts w:ascii="Consolas" w:hAnsi="Consolas" w:cs="Consolas"/>
+          <w:sz w:val="20"/>
+        </w:rPr>
+        <w:t xml:space="preserve">scripts/db/realtime-rls.mjs</w:t>
+      </w:r>
+      <w:r>
         <w:t xml:space="preserve">, Vitest in </w:t>
       </w:r>
       <w:r>
@@ -2290,6 +2330,94 @@
         <w:rPr>
           <w:b/>
         </w:rPr>
+        <w:t xml:space="preserve">Realtime transport.</w:t>
+      </w:r>
+      <w:r>
+        <w:t xml:space="preserve"> Decision (milestone 7): Supabase Realtime </w:t>
+      </w:r>
+      <w:r>
+        <w:rPr>
+          <w:rFonts w:ascii="Consolas" w:hAnsi="Consolas" w:cs="Consolas"/>
+          <w:sz w:val="20"/>
+        </w:rPr>
+        <w:t xml:space="preserve">postgres_changes</w:t>
+      </w:r>
+      <w:r>
+        <w:t xml:space="preserve"> for the MVP; Broadcast or a custom WebSocket server remain later options.</w:t>
+      </w:r>
+    </w:p>
+    <w:p>
+      <w:pPr>
+        <w:pStyle w:val="ListBullet"/>
+      </w:pPr>
+      <w:r>
+        <w:rPr>
+          <w:b/>
+        </w:rPr>
+        <w:t xml:space="preserve">What is published.</w:t>
+      </w:r>
+      <w:r>
+        <w:t xml:space="preserve"> Decision (milestone 7): only </w:t>
+      </w:r>
+      <w:r>
+        <w:rPr>
+          <w:rFonts w:ascii="Consolas" w:hAnsi="Consolas" w:cs="Consolas"/>
+          <w:sz w:val="20"/>
+        </w:rPr>
+        <w:t xml:space="preserve">messages</w:t>
+      </w:r>
+      <w:r>
+        <w:t xml:space="preserve"> and </w:t>
+      </w:r>
+      <w:r>
+        <w:rPr>
+          <w:rFonts w:ascii="Consolas" w:hAnsi="Consolas" w:cs="Consolas"/>
+          <w:sz w:val="20"/>
+        </w:rPr>
+        <w:t xml:space="preserve">friend_requests</w:t>
+      </w:r>
+      <w:r>
+        <w:t xml:space="preserve">. Realtime cannot apply RLS to DELETE events and sends their old primary key to every subscriber, so tables keyed by user ids (</w:t>
+      </w:r>
+      <w:r>
+        <w:rPr>
+          <w:rFonts w:ascii="Consolas" w:hAnsi="Consolas" w:cs="Consolas"/>
+          <w:sz w:val="20"/>
+        </w:rPr>
+        <w:t xml:space="preserve">friendships</w:t>
+      </w:r>
+      <w:r>
+        <w:t xml:space="preserve">, </w:t>
+      </w:r>
+      <w:r>
+        <w:rPr>
+          <w:rFonts w:ascii="Consolas" w:hAnsi="Consolas" w:cs="Consolas"/>
+          <w:sz w:val="20"/>
+        </w:rPr>
+        <w:t xml:space="preserve">conversation_members</w:t>
+      </w:r>
+      <w:r>
+        <w:t xml:space="preserve">, </w:t>
+      </w:r>
+      <w:r>
+        <w:rPr>
+          <w:rFonts w:ascii="Consolas" w:hAnsi="Consolas" w:cs="Consolas"/>
+          <w:sz w:val="20"/>
+        </w:rPr>
+        <w:t xml:space="preserve">blocks</w:t>
+      </w:r>
+      <w:r>
+        <w:t xml:space="preserve">) are never published. As a result, becoming read-only after an unfriend shows on the next send or when the tab regains focus, not live.</w:t>
+      </w:r>
+    </w:p>
+    <w:p>
+      <w:pPr>
+        <w:pStyle w:val="ListBullet"/>
+      </w:pPr>
+      <w:r>
+        <w:rPr>
+          <w:b/>
+        </w:rPr>
         <w:t xml:space="preserve">Home screen.</w:t>
       </w:r>
       <w:r>
@@ -2388,20 +2516,6 @@
         <w:rPr>
           <w:b/>
         </w:rPr>
-        <w:t xml:space="preserve">Supabase Realtime versus a custom WebSocket server.</w:t>
-      </w:r>
-      <w:r>
-        <w:t xml:space="preserve"> Recommendation: Supabase Realtime for the MVP; a custom server later as a learning exercise.</w:t>
-      </w:r>
-    </w:p>
-    <w:p>
-      <w:pPr>
-        <w:pStyle w:val="ListBullet"/>
-      </w:pPr>
-      <w:r>
-        <w:rPr>
-          <w:b/>
-        </w:rPr>
         <w:t xml:space="preserve">Request expiration.</w:t>
       </w:r>
       <w:r>
@@ -2540,6 +2654,20 @@
       </w:r>
       <w:r>
         <w:t xml:space="preserve"> milestone 6: message delete rules and insert grants, Home as the chat list, no message rate limit, section 10 updated.</w:t>
+      </w:r>
+    </w:p>
+    <w:p>
+      <w:pPr>
+        <w:pStyle w:val="ListBullet"/>
+      </w:pPr>
+      <w:r>
+        <w:rPr>
+          <w:b/>
+        </w:rPr>
+        <w:t xml:space="preserve">v2.8, 16 October 2026:</w:t>
+      </w:r>
+      <w:r>
+        <w:t xml:space="preserve"> milestone 7: realtime transport decided, publication limited to tables whose deletes leak nothing, section 10 updated.</w:t>
       </w:r>
     </w:p>
     <w:p>

</xml_diff>

<commit_message>
Unread counts, read receipts, typing and online status
Milestone 8. mark_read moves your reading position only forward (checking
membership first) and announces it from the database; my_conversations
returns unread counts; Home shows them live and the tab title shows the
total. Typing indicators and online status use private Realtime channels
(conversation:<id>, user:<id>) authorized by policies on
realtime.messages: members listen, current friends send, presence only for
friends. A trigger on friendships announces changes, so an open chat
turns read-only live. AppShell keeps one chat list and presence for all
signed-in pages. Spec v2.9.
</commit_message>
<xml_diff>
--- a/Chat_App_Project_Specification.docx
+++ b/Chat_App_Project_Specification.docx
@@ -18,7 +18,7 @@
         <w:t xml:space="preserve">Status:</w:t>
       </w:r>
       <w:r>
-        <w:t xml:space="preserve"> Revised draft v2.8, 16 October 2026. Milestones 1–6 are complete and milestone 7 is built; see docs/PROGRESS.md in the repository for detailed progress.</w:t>
+        <w:t xml:space="preserve"> Revised draft v2.9, 16 October 2026. Milestones 1–7 are complete and milestone 8 is built; see docs/PROGRESS.md in the repository for detailed progress.</w:t>
       </w:r>
     </w:p>
     <w:p>
@@ -1561,7 +1561,27 @@
         <w:t xml:space="preserve">postgres_changes</w:t>
       </w:r>
       <w:r>
-        <w:t xml:space="preserve"> applies the table's SELECT policy to each subscriber for inserts and updates, so message delivery follows read access automatically. DELETE events cannot be checked and reach every subscriber with the old primary key, which limits which tables may be published (section 11). Broadcast and Presence do not; if they are used for typing indicators or online status, they must use private channels with policies on </w:t>
+        <w:t xml:space="preserve"> applies the table's SELECT policy to each subscriber for inserts and updates, so message delivery follows read access automatically. DELETE events cannot be checked and reach every subscriber with the old primary key, which limits which tables may be published (section 11). Broadcast and Presence do not; typing indicators and online status therefore use private channels (</w:t>
+      </w:r>
+      <w:r>
+        <w:rPr>
+          <w:rFonts w:ascii="Consolas" w:hAnsi="Consolas" w:cs="Consolas"/>
+          <w:sz w:val="20"/>
+        </w:rPr>
+        <w:t xml:space="preserve">conversation:&lt;id&gt;</w:t>
+      </w:r>
+      <w:r>
+        <w:t xml:space="preserve">, </w:t>
+      </w:r>
+      <w:r>
+        <w:rPr>
+          <w:rFonts w:ascii="Consolas" w:hAnsi="Consolas" w:cs="Consolas"/>
+          <w:sz w:val="20"/>
+        </w:rPr>
+        <w:t xml:space="preserve">user:&lt;id&gt;</w:t>
+      </w:r>
+      <w:r>
+        <w:t xml:space="preserve">) with policies on </w:t>
       </w:r>
       <w:r>
         <w:rPr>
@@ -1571,7 +1591,7 @@
         <w:t xml:space="preserve">realtime.messages</w:t>
       </w:r>
       <w:r>
-        <w:t xml:space="preserve">.</w:t>
+        <w:t xml:space="preserve">, checked when a client joins.</w:t>
       </w:r>
     </w:p>
     <w:p>
@@ -1903,7 +1923,7 @@
         <w:pStyle w:val="ListBullet"/>
       </w:pPr>
       <w:r>
-        <w:t xml:space="preserve">Milestones 1 (foundation), 2 (auth, including password reset), 3 (profiles and avatars) 4 (search, friend requests and blocking) and 5 (friendships and conversations) and 6 (persistent direct messages) are complete; milestone 7 (realtime delivery and recovery) is built. Detailed progress, open items and next steps live in </w:t>
+        <w:t xml:space="preserve">Milestones 1 (foundation), 2 (auth, including password reset), 3 (profiles and avatars) 4 (search, friend requests and blocking) and 5 (friendships and conversations) 6 (persistent direct messages) and 7 (realtime delivery and recovery) are complete; milestone 8 (unread counts, read receipts, typing, online status) is built. Detailed progress, open items and next steps live in </w:t>
       </w:r>
       <w:r>
         <w:rPr>
@@ -1941,7 +1961,7 @@
         <w:t xml:space="preserve">design/sign-in.png</w:t>
       </w:r>
       <w:r>
-        <w:t xml:space="preserve">), sign up, check email, forgot and reset password, onboarding, profile settings with avatar upload, people search, friend requests, public profiles with unfriend and block, a home screen listing your chats, and a chat screen with history paging; messages, chat previews and friend requests update live.</w:t>
+        <w:t xml:space="preserve">), sign up, check email, forgot and reset password, onboarding, profile settings with avatar upload, people search, friend requests, public profiles with unfriend and block, a home screen listing your chats, and a chat screen with history paging; messages, chat previews and friend requests update live, with unread counts, read receipts, typing indicators and online status.</w:t>
       </w:r>
     </w:p>
     <w:p>
@@ -2109,7 +2129,27 @@
         <w:t xml:space="preserve">supabase_realtime</w:t>
       </w:r>
       <w:r>
-        <w:t xml:space="preserve"> publication. Tests: pgTAP in </w:t>
+        <w:t xml:space="preserve"> publication; </w:t>
+      </w:r>
+      <w:r>
+        <w:rPr>
+          <w:rFonts w:ascii="Consolas" w:hAnsi="Consolas" w:cs="Consolas"/>
+          <w:sz w:val="20"/>
+        </w:rPr>
+        <w:t xml:space="preserve">mark_read</w:t>
+      </w:r>
+      <w:r>
+        <w:t xml:space="preserve"> and policies on </w:t>
+      </w:r>
+      <w:r>
+        <w:rPr>
+          <w:rFonts w:ascii="Consolas" w:hAnsi="Consolas" w:cs="Consolas"/>
+          <w:sz w:val="20"/>
+        </w:rPr>
+        <w:t xml:space="preserve">realtime.messages</w:t>
+      </w:r>
+      <w:r>
+        <w:t xml:space="preserve"> for private channels. Tests: pgTAP in </w:t>
       </w:r>
       <w:r>
         <w:rPr>
@@ -2407,7 +2447,55 @@
         <w:t xml:space="preserve">blocks</w:t>
       </w:r>
       <w:r>
-        <w:t xml:space="preserve">) are never published. As a result, becoming read-only after an unfriend shows on the next send or when the tab regains focus, not live.</w:t>
+        <w:t xml:space="preserve">) are never published. A database trigger instead announces friendship changes on the conversation's private channel (milestone 8), so an open chat turns read-only live.</w:t>
+      </w:r>
+    </w:p>
+    <w:p>
+      <w:pPr>
+        <w:pStyle w:val="ListBullet"/>
+      </w:pPr>
+      <w:r>
+        <w:rPr>
+          <w:b/>
+        </w:rPr>
+        <w:t xml:space="preserve">Read receipts.</w:t>
+      </w:r>
+      <w:r>
+        <w:t xml:space="preserve"> Decision (milestone 8): always on, no setting. Reading positions only move forward and are changed only by </w:t>
+      </w:r>
+      <w:r>
+        <w:rPr>
+          <w:rFonts w:ascii="Consolas" w:hAnsi="Consolas" w:cs="Consolas"/>
+          <w:sz w:val="20"/>
+        </w:rPr>
+        <w:t xml:space="preserve">mark_read</w:t>
+      </w:r>
+      <w:r>
+        <w:t xml:space="preserve">, which announces them from the database.</w:t>
+      </w:r>
+    </w:p>
+    <w:p>
+      <w:pPr>
+        <w:pStyle w:val="ListBullet"/>
+      </w:pPr>
+      <w:r>
+        <w:rPr>
+          <w:b/>
+        </w:rPr>
+        <w:t xml:space="preserve">Online status.</w:t>
+      </w:r>
+      <w:r>
+        <w:t xml:space="preserve"> Decision (milestone 8): visible to current friends only, through Presence on a private </w:t>
+      </w:r>
+      <w:r>
+        <w:rPr>
+          <w:rFonts w:ascii="Consolas" w:hAnsi="Consolas" w:cs="Consolas"/>
+          <w:sz w:val="20"/>
+        </w:rPr>
+        <w:t xml:space="preserve">user:&lt;id&gt;</w:t>
+      </w:r>
+      <w:r>
+        <w:t xml:space="preserve"> channel. No "last seen". Known limit: Realtime checks channel policies on join and on token refresh, so an already-joined former friend can keep receiving presence for up to an hour unless their app leaves the channel (the app does).</w:t>
       </w:r>
     </w:p>
     <w:p>
@@ -2668,6 +2756,20 @@
       </w:r>
       <w:r>
         <w:t xml:space="preserve"> milestone 7: realtime transport decided, publication limited to tables whose deletes leak nothing, section 10 updated.</w:t>
+      </w:r>
+    </w:p>
+    <w:p>
+      <w:pPr>
+        <w:pStyle w:val="ListBullet"/>
+      </w:pPr>
+      <w:r>
+        <w:rPr>
+          <w:b/>
+        </w:rPr>
+        <w:t xml:space="preserve">v2.9, 16 October 2026:</w:t>
+      </w:r>
+      <w:r>
+        <w:t xml:space="preserve"> milestone 8: read receipts and online status decided, private channels described, friendship changes announced live, section 10 updated.</w:t>
       </w:r>
     </w:p>
     <w:p>

</xml_diff>

<commit_message>
Account deletion, file cleanup and release hardening
</commit_message>
<xml_diff>
--- a/Chat_App_Project_Specification.docx
+++ b/Chat_App_Project_Specification.docx
@@ -18,7 +18,7 @@
         <w:t xml:space="preserve">Status:</w:t>
       </w:r>
       <w:r>
-        <w:t xml:space="preserve"> Revised draft v3.0, 17 October 2026. Milestones 1–8 are complete and milestone 9 is built; see docs/PROGRESS.md in the repository for detailed progress.</w:t>
+        <w:t xml:space="preserve"> Revised draft v3.1, 17 October 2026. Milestones 1–9 are complete; milestone 10 (release) is in progress, with its local part built; see docs/PROGRESS.md in the repository for detailed progress.</w:t>
       </w:r>
     </w:p>
     <w:p>
@@ -1964,7 +1964,7 @@
         <w:pStyle w:val="ListBullet"/>
       </w:pPr>
       <w:r>
-        <w:t xml:space="preserve">Milestones 1 (foundation), 2 (auth, including password reset), 3 (profiles and avatars) 4 (search, friend requests and blocking) and 5 (friendships and conversations) 6 (persistent direct messages) and 7 (realtime delivery and recovery) and 8 (unread counts, read receipts, typing, online status) are complete; milestone 9 (image messages) is built. Detailed progress, open items and next steps live in </w:t>
+        <w:t xml:space="preserve">Milestones 1 (foundation), 2 (auth, including password reset), 3 (profiles and avatars) 4 (search, friend requests and blocking) and 5 (friendships and conversations) 6 (persistent direct messages) and 7 (realtime delivery and recovery) 8 (unread counts, read receipts, typing, online status) and 9 (image messages) are complete. Milestone 10a is built: advisor fixes, a manual security review, a daily file cleanup, account deletion in the app and a mobile pass; 10b (deployment) is next. Detailed progress, open items and next steps live in </w:t>
       </w:r>
       <w:r>
         <w:rPr>
@@ -2553,6 +2553,104 @@
         <w:rPr>
           <w:b/>
         </w:rPr>
+        <w:t xml:space="preserve">File cleanup.</w:t>
+      </w:r>
+      <w:r>
+        <w:t xml:space="preserve"> Decision (milestone 10): a </w:t>
+      </w:r>
+      <w:r>
+        <w:rPr>
+          <w:rFonts w:ascii="Consolas" w:hAnsi="Consolas" w:cs="Consolas"/>
+          <w:sz w:val="20"/>
+        </w:rPr>
+        <w:t xml:space="preserve">cleanup-files</w:t>
+      </w:r>
+      <w:r>
+        <w:t xml:space="preserve"> Edge Function, called daily by </w:t>
+      </w:r>
+      <w:r>
+        <w:rPr>
+          <w:rFonts w:ascii="Consolas" w:hAnsi="Consolas" w:cs="Consolas"/>
+          <w:sz w:val="20"/>
+        </w:rPr>
+        <w:t xml:space="preserve">pg_cron</w:t>
+      </w:r>
+      <w:r>
+        <w:t xml:space="preserve"> through </w:t>
+      </w:r>
+      <w:r>
+        <w:rPr>
+          <w:rFonts w:ascii="Consolas" w:hAnsi="Consolas" w:cs="Consolas"/>
+          <w:sz w:val="20"/>
+        </w:rPr>
+        <w:t xml:space="preserve">pg_net</w:t>
+      </w:r>
+      <w:r>
+        <w:t xml:space="preserve"> with a secret kept in Vault, deletes files that no </w:t>
+      </w:r>
+      <w:r>
+        <w:rPr>
+          <w:rFonts w:ascii="Consolas" w:hAnsi="Consolas" w:cs="Consolas"/>
+          <w:sz w:val="20"/>
+        </w:rPr>
+        <w:t xml:space="preserve">avatar_path</w:t>
+      </w:r>
+      <w:r>
+        <w:t xml:space="preserve"> or </w:t>
+      </w:r>
+      <w:r>
+        <w:rPr>
+          <w:rFonts w:ascii="Consolas" w:hAnsi="Consolas" w:cs="Consolas"/>
+          <w:sz w:val="20"/>
+        </w:rPr>
+        <w:t xml:space="preserve">message_attachments</w:t>
+      </w:r>
+      <w:r>
+        <w:t xml:space="preserve"> row points at and that are over a day old (an upload may be mid-send). SQL lists them (</w:t>
+      </w:r>
+      <w:r>
+        <w:rPr>
+          <w:rFonts w:ascii="Consolas" w:hAnsi="Consolas" w:cs="Consolas"/>
+          <w:sz w:val="20"/>
+        </w:rPr>
+        <w:t xml:space="preserve">orphan_files</w:t>
+      </w:r>
+      <w:r>
+        <w:t xml:space="preserve">, service role only); only the Storage API can delete them.</w:t>
+      </w:r>
+    </w:p>
+    <w:p>
+      <w:pPr>
+        <w:pStyle w:val="ListBullet"/>
+      </w:pPr>
+      <w:r>
+        <w:rPr>
+          <w:b/>
+        </w:rPr>
+        <w:t xml:space="preserve">Account deletion in the app.</w:t>
+      </w:r>
+      <w:r>
+        <w:t xml:space="preserve"> Decision (milestone 10): Settings offers "Delete account", which asks for the password again; a </w:t>
+      </w:r>
+      <w:r>
+        <w:rPr>
+          <w:rFonts w:ascii="Consolas" w:hAnsi="Consolas" w:cs="Consolas"/>
+          <w:sz w:val="20"/>
+        </w:rPr>
+        <w:t xml:space="preserve">delete-account</w:t>
+      </w:r>
+      <w:r>
+        <w:t xml:space="preserve"> Edge Function checks it and deletes the user through the Auth admin API. What goes and what stays follows the account-deletion decision above.</w:t>
+      </w:r>
+    </w:p>
+    <w:p>
+      <w:pPr>
+        <w:pStyle w:val="ListBullet"/>
+      </w:pPr>
+      <w:r>
+        <w:rPr>
+          <w:b/>
+        </w:rPr>
         <w:t xml:space="preserve">Message images.</w:t>
       </w:r>
       <w:r>
@@ -2855,6 +2953,20 @@
       </w:r>
       <w:r>
         <w:t xml:space="preserve"> milestone 8: read receipts and online status decided, private channels described, friendship changes announced live, section 10 updated.</w:t>
+      </w:r>
+    </w:p>
+    <w:p>
+      <w:pPr>
+        <w:pStyle w:val="ListBullet"/>
+      </w:pPr>
+      <w:r>
+        <w:rPr>
+          <w:b/>
+        </w:rPr>
+        <w:t xml:space="preserve">v3.1, 17 October 2026:</w:t>
+      </w:r>
+      <w:r>
+        <w:t xml:space="preserve"> milestone 10a: file cleanup and account deletion decided, section 10 updated.</w:t>
       </w:r>
     </w:p>
     <w:p>

</xml_diff>